<commit_message>
style(sidebar): major sidebar redesign - remove vertical line, TOC-style active indicator, flat section/labels, accent category headers, hover effect cleanup
</commit_message>
<xml_diff>
--- a/StandardsHub.docx
+++ b/StandardsHub.docx
@@ -563,7 +563,7 @@
       </w:pPr>
       <w:r>
         <w:pict w14:anchorId="1D57CDD4">
-          <v:rect id="_x0000_i1097" style="width:0;height:1.5pt" o:hralign="center" o:hrstd="t" o:hr="t" fillcolor="#a0a0a0" stroked="f"/>
+          <v:rect id="_x0000_i1025" style="width:0;height:1.5pt" o:hralign="center" o:hrstd="t" o:hr="t" fillcolor="#a0a0a0" stroked="f"/>
         </w:pict>
       </w:r>
     </w:p>
@@ -1211,7 +1211,7 @@
       </w:pPr>
       <w:r>
         <w:pict w14:anchorId="4C7FF46A">
-          <v:rect id="_x0000_i1098" style="width:0;height:1.5pt" o:hralign="center" o:hrstd="t" o:hr="t" fillcolor="#a0a0a0" stroked="f"/>
+          <v:rect id="_x0000_i1026" style="width:0;height:1.5pt" o:hralign="center" o:hrstd="t" o:hr="t" fillcolor="#a0a0a0" stroked="f"/>
         </w:pict>
       </w:r>
     </w:p>
@@ -1515,7 +1515,7 @@
       </w:pPr>
       <w:r>
         <w:pict w14:anchorId="63D05B66">
-          <v:rect id="_x0000_i1099" style="width:0;height:1.5pt" o:hralign="center" o:hrstd="t" o:hr="t" fillcolor="#a0a0a0" stroked="f"/>
+          <v:rect id="_x0000_i1027" style="width:0;height:1.5pt" o:hralign="center" o:hrstd="t" o:hr="t" fillcolor="#a0a0a0" stroked="f"/>
         </w:pict>
       </w:r>
     </w:p>
@@ -2079,7 +2079,7 @@
       </w:pPr>
       <w:r>
         <w:pict w14:anchorId="4B4F508A">
-          <v:rect id="_x0000_i1100" style="width:0;height:1.5pt" o:hralign="center" o:hrstd="t" o:hr="t" fillcolor="#a0a0a0" stroked="f"/>
+          <v:rect id="_x0000_i1028" style="width:0;height:1.5pt" o:hralign="center" o:hrstd="t" o:hr="t" fillcolor="#a0a0a0" stroked="f"/>
         </w:pict>
       </w:r>
     </w:p>
@@ -2221,7 +2221,7 @@
       </w:pPr>
       <w:r>
         <w:pict w14:anchorId="3CD19AF8">
-          <v:rect id="_x0000_i1101" style="width:0;height:1.5pt" o:hralign="center" o:hrstd="t" o:hr="t" fillcolor="#a0a0a0" stroked="f"/>
+          <v:rect id="_x0000_i1029" style="width:0;height:1.5pt" o:hralign="center" o:hrstd="t" o:hr="t" fillcolor="#a0a0a0" stroked="f"/>
         </w:pict>
       </w:r>
     </w:p>
@@ -2487,7 +2487,7 @@
       </w:pPr>
       <w:r>
         <w:pict w14:anchorId="5032F7F5">
-          <v:rect id="_x0000_i1102" style="width:0;height:1.5pt" o:hralign="center" o:hrstd="t" o:hr="t" fillcolor="#a0a0a0" stroked="f"/>
+          <v:rect id="_x0000_i1030" style="width:0;height:1.5pt" o:hralign="center" o:hrstd="t" o:hr="t" fillcolor="#a0a0a0" stroked="f"/>
         </w:pict>
       </w:r>
     </w:p>
@@ -2597,7 +2597,7 @@
       </w:pPr>
       <w:r>
         <w:pict w14:anchorId="4E5F4001">
-          <v:rect id="_x0000_i1103" style="width:0;height:1.5pt" o:hralign="center" o:hrstd="t" o:hr="t" fillcolor="#a0a0a0" stroked="f"/>
+          <v:rect id="_x0000_i1031" style="width:0;height:1.5pt" o:hralign="center" o:hrstd="t" o:hr="t" fillcolor="#a0a0a0" stroked="f"/>
         </w:pict>
       </w:r>
     </w:p>
@@ -2910,7 +2910,7 @@
       </w:pPr>
       <w:r>
         <w:pict w14:anchorId="37274393">
-          <v:rect id="_x0000_i1104" style="width:0;height:1.5pt" o:hralign="center" o:hrstd="t" o:hr="t" fillcolor="#a0a0a0" stroked="f"/>
+          <v:rect id="_x0000_i1032" style="width:0;height:1.5pt" o:hralign="center" o:hrstd="t" o:hr="t" fillcolor="#a0a0a0" stroked="f"/>
         </w:pict>
       </w:r>
     </w:p>
@@ -3573,7 +3573,7 @@
       </w:pPr>
       <w:r>
         <w:pict w14:anchorId="785836BD">
-          <v:rect id="_x0000_i1105" style="width:0;height:1.5pt" o:hralign="center" o:hrstd="t" o:hr="t" fillcolor="#a0a0a0" stroked="f"/>
+          <v:rect id="_x0000_i1033" style="width:0;height:1.5pt" o:hralign="center" o:hrstd="t" o:hr="t" fillcolor="#a0a0a0" stroked="f"/>
         </w:pict>
       </w:r>
     </w:p>
@@ -3873,7 +3873,7 @@
       </w:pPr>
       <w:r>
         <w:pict w14:anchorId="6B38F6C8">
-          <v:rect id="_x0000_i1106" style="width:0;height:1.5pt" o:hralign="center" o:hrstd="t" o:hr="t" fillcolor="#a0a0a0" stroked="f"/>
+          <v:rect id="_x0000_i1034" style="width:0;height:1.5pt" o:hralign="center" o:hrstd="t" o:hr="t" fillcolor="#a0a0a0" stroked="f"/>
         </w:pict>
       </w:r>
     </w:p>
@@ -4112,7 +4112,7 @@
       </w:pPr>
       <w:r>
         <w:pict w14:anchorId="036035E5">
-          <v:rect id="_x0000_i1107" style="width:0;height:1.5pt" o:hralign="center" o:hrstd="t" o:hr="t" fillcolor="#a0a0a0" stroked="f"/>
+          <v:rect id="_x0000_i1035" style="width:0;height:1.5pt" o:hralign="center" o:hrstd="t" o:hr="t" fillcolor="#a0a0a0" stroked="f"/>
         </w:pict>
       </w:r>
     </w:p>
@@ -4266,7 +4266,7 @@
       </w:pPr>
       <w:r>
         <w:pict w14:anchorId="1D004093">
-          <v:rect id="_x0000_i1108" style="width:0;height:1.5pt" o:hralign="center" o:hrstd="t" o:hr="t" fillcolor="#a0a0a0" stroked="f"/>
+          <v:rect id="_x0000_i1036" style="width:0;height:1.5pt" o:hralign="center" o:hrstd="t" o:hr="t" fillcolor="#a0a0a0" stroked="f"/>
         </w:pict>
       </w:r>
     </w:p>
@@ -4888,6 +4888,1029 @@
     </w:p>
     <w:p>
       <w:pPr>
+        <w:rPr>
+          <w:b/>
+          <w:bCs/>
+        </w:rPr>
+      </w:pPr>
+      <w:r>
+        <w:rPr>
+          <w:b/>
+          <w:bCs/>
+        </w:rPr>
+        <w:lastRenderedPageBreak/>
+        <w:t>Phase B — Critical site-wide QC</w:t>
+      </w:r>
+    </w:p>
+    <w:p>
+      <w:r>
+        <w:t>This is what I would prioritize:</w:t>
+      </w:r>
+    </w:p>
+    <w:p>
+      <w:pPr>
+        <w:numPr>
+          <w:ilvl w:val="0"/>
+          <w:numId w:val="22"/>
+        </w:numPr>
+      </w:pPr>
+      <w:r>
+        <w:rPr>
+          <w:b/>
+          <w:bCs/>
+        </w:rPr>
+        <w:t>Framework Rail</w:t>
+      </w:r>
+      <w:r>
+        <w:t xml:space="preserve"> </w:t>
+      </w:r>
+    </w:p>
+    <w:p>
+      <w:pPr>
+        <w:numPr>
+          <w:ilvl w:val="1"/>
+          <w:numId w:val="22"/>
+        </w:numPr>
+      </w:pPr>
+      <w:r>
+        <w:t xml:space="preserve">enabled frameworks </w:t>
+      </w:r>
+    </w:p>
+    <w:p>
+      <w:pPr>
+        <w:numPr>
+          <w:ilvl w:val="1"/>
+          <w:numId w:val="22"/>
+        </w:numPr>
+      </w:pPr>
+      <w:r>
+        <w:t xml:space="preserve">correct colours </w:t>
+      </w:r>
+    </w:p>
+    <w:p>
+      <w:pPr>
+        <w:numPr>
+          <w:ilvl w:val="1"/>
+          <w:numId w:val="22"/>
+        </w:numPr>
+      </w:pPr>
+      <w:r>
+        <w:t xml:space="preserve">correct ordering </w:t>
+      </w:r>
+    </w:p>
+    <w:p>
+      <w:pPr>
+        <w:numPr>
+          <w:ilvl w:val="1"/>
+          <w:numId w:val="22"/>
+        </w:numPr>
+      </w:pPr>
+      <w:r>
+        <w:t xml:space="preserve">switching works </w:t>
+      </w:r>
+    </w:p>
+    <w:p>
+      <w:pPr>
+        <w:numPr>
+          <w:ilvl w:val="1"/>
+          <w:numId w:val="22"/>
+        </w:numPr>
+      </w:pPr>
+      <w:r>
+        <w:t xml:space="preserve">no accidental framework bleed </w:t>
+      </w:r>
+    </w:p>
+    <w:p>
+      <w:pPr>
+        <w:numPr>
+          <w:ilvl w:val="0"/>
+          <w:numId w:val="22"/>
+        </w:numPr>
+      </w:pPr>
+      <w:r>
+        <w:rPr>
+          <w:b/>
+          <w:bCs/>
+        </w:rPr>
+        <w:t>Sidebar</w:t>
+      </w:r>
+      <w:r>
+        <w:t xml:space="preserve"> </w:t>
+      </w:r>
+    </w:p>
+    <w:p>
+      <w:pPr>
+        <w:numPr>
+          <w:ilvl w:val="1"/>
+          <w:numId w:val="22"/>
+        </w:numPr>
+      </w:pPr>
+      <w:r>
+        <w:t xml:space="preserve">correct standards </w:t>
+      </w:r>
+    </w:p>
+    <w:p>
+      <w:pPr>
+        <w:numPr>
+          <w:ilvl w:val="1"/>
+          <w:numId w:val="22"/>
+        </w:numPr>
+      </w:pPr>
+      <w:r>
+        <w:t xml:space="preserve">correct links </w:t>
+      </w:r>
+    </w:p>
+    <w:p>
+      <w:pPr>
+        <w:numPr>
+          <w:ilvl w:val="1"/>
+          <w:numId w:val="22"/>
+        </w:numPr>
+      </w:pPr>
+      <w:r>
+        <w:t xml:space="preserve">active item </w:t>
+      </w:r>
+    </w:p>
+    <w:p>
+      <w:pPr>
+        <w:numPr>
+          <w:ilvl w:val="1"/>
+          <w:numId w:val="22"/>
+        </w:numPr>
+      </w:pPr>
+      <w:r>
+        <w:t xml:space="preserve">scrollbar </w:t>
+      </w:r>
+    </w:p>
+    <w:p>
+      <w:pPr>
+        <w:numPr>
+          <w:ilvl w:val="1"/>
+          <w:numId w:val="22"/>
+        </w:numPr>
+      </w:pPr>
+      <w:r>
+        <w:t xml:space="preserve">framework accent </w:t>
+      </w:r>
+    </w:p>
+    <w:p>
+      <w:pPr>
+        <w:numPr>
+          <w:ilvl w:val="1"/>
+          <w:numId w:val="22"/>
+        </w:numPr>
+      </w:pPr>
+      <w:r>
+        <w:t xml:space="preserve">no empty sidebar after navigation </w:t>
+      </w:r>
+    </w:p>
+    <w:p>
+      <w:pPr>
+        <w:numPr>
+          <w:ilvl w:val="0"/>
+          <w:numId w:val="22"/>
+        </w:numPr>
+      </w:pPr>
+      <w:r>
+        <w:rPr>
+          <w:b/>
+          <w:bCs/>
+        </w:rPr>
+        <w:t>TOC</w:t>
+      </w:r>
+      <w:r>
+        <w:t xml:space="preserve"> </w:t>
+      </w:r>
+    </w:p>
+    <w:p>
+      <w:pPr>
+        <w:numPr>
+          <w:ilvl w:val="1"/>
+          <w:numId w:val="22"/>
+        </w:numPr>
+      </w:pPr>
+      <w:r>
+        <w:t xml:space="preserve">correct entries </w:t>
+      </w:r>
+    </w:p>
+    <w:p>
+      <w:pPr>
+        <w:numPr>
+          <w:ilvl w:val="1"/>
+          <w:numId w:val="22"/>
+        </w:numPr>
+      </w:pPr>
+      <w:r>
+        <w:t xml:space="preserve">anchors work </w:t>
+      </w:r>
+    </w:p>
+    <w:p>
+      <w:pPr>
+        <w:numPr>
+          <w:ilvl w:val="1"/>
+          <w:numId w:val="22"/>
+        </w:numPr>
+      </w:pPr>
+      <w:r>
+        <w:t xml:space="preserve">active section follows scrolling </w:t>
+      </w:r>
+    </w:p>
+    <w:p>
+      <w:pPr>
+        <w:numPr>
+          <w:ilvl w:val="1"/>
+          <w:numId w:val="22"/>
+        </w:numPr>
+      </w:pPr>
+      <w:r>
+        <w:t xml:space="preserve">no orphan links </w:t>
+      </w:r>
+    </w:p>
+    <w:p>
+      <w:pPr>
+        <w:numPr>
+          <w:ilvl w:val="0"/>
+          <w:numId w:val="22"/>
+        </w:numPr>
+      </w:pPr>
+      <w:r>
+        <w:rPr>
+          <w:b/>
+          <w:bCs/>
+        </w:rPr>
+        <w:t>Previous / Next</w:t>
+      </w:r>
+      <w:r>
+        <w:t xml:space="preserve"> </w:t>
+      </w:r>
+    </w:p>
+    <w:p>
+      <w:pPr>
+        <w:numPr>
+          <w:ilvl w:val="1"/>
+          <w:numId w:val="22"/>
+        </w:numPr>
+      </w:pPr>
+      <w:r>
+        <w:t xml:space="preserve">especially around lifecycle/revised/withdrawn standards </w:t>
+      </w:r>
+    </w:p>
+    <w:p>
+      <w:pPr>
+        <w:numPr>
+          <w:ilvl w:val="1"/>
+          <w:numId w:val="22"/>
+        </w:numPr>
+      </w:pPr>
+      <w:r>
+        <w:t xml:space="preserve">no cross-framework jumps </w:t>
+      </w:r>
+    </w:p>
+    <w:p>
+      <w:pPr>
+        <w:numPr>
+          <w:ilvl w:val="0"/>
+          <w:numId w:val="22"/>
+        </w:numPr>
+      </w:pPr>
+      <w:r>
+        <w:rPr>
+          <w:b/>
+          <w:bCs/>
+        </w:rPr>
+        <w:t>Global Search</w:t>
+      </w:r>
+      <w:r>
+        <w:t xml:space="preserve"> </w:t>
+      </w:r>
+    </w:p>
+    <w:p>
+      <w:pPr>
+        <w:numPr>
+          <w:ilvl w:val="1"/>
+          <w:numId w:val="22"/>
+        </w:numPr>
+      </w:pPr>
+      <w:r>
+        <w:t xml:space="preserve">search works </w:t>
+      </w:r>
+    </w:p>
+    <w:p>
+      <w:pPr>
+        <w:numPr>
+          <w:ilvl w:val="1"/>
+          <w:numId w:val="22"/>
+        </w:numPr>
+      </w:pPr>
+      <w:r>
+        <w:t xml:space="preserve">suggestions </w:t>
+      </w:r>
+    </w:p>
+    <w:p>
+      <w:pPr>
+        <w:numPr>
+          <w:ilvl w:val="1"/>
+          <w:numId w:val="22"/>
+        </w:numPr>
+      </w:pPr>
+      <w:r>
+        <w:t xml:space="preserve">standard → correct URL </w:t>
+      </w:r>
+    </w:p>
+    <w:p>
+      <w:pPr>
+        <w:numPr>
+          <w:ilvl w:val="1"/>
+          <w:numId w:val="22"/>
+        </w:numPr>
+      </w:pPr>
+      <w:r>
+        <w:t xml:space="preserve">framework filtering/recognition </w:t>
+      </w:r>
+    </w:p>
+    <w:p>
+      <w:pPr>
+        <w:numPr>
+          <w:ilvl w:val="0"/>
+          <w:numId w:val="22"/>
+        </w:numPr>
+      </w:pPr>
+      <w:r>
+        <w:rPr>
+          <w:b/>
+          <w:bCs/>
+        </w:rPr>
+        <w:t>Content positioning</w:t>
+      </w:r>
+      <w:r>
+        <w:t xml:space="preserve"> </w:t>
+      </w:r>
+    </w:p>
+    <w:p>
+      <w:pPr>
+        <w:numPr>
+          <w:ilvl w:val="1"/>
+          <w:numId w:val="22"/>
+        </w:numPr>
+      </w:pPr>
+      <w:r>
+        <w:t xml:space="preserve">browser back/forward </w:t>
+      </w:r>
+    </w:p>
+    <w:p>
+      <w:pPr>
+        <w:numPr>
+          <w:ilvl w:val="1"/>
+          <w:numId w:val="22"/>
+        </w:numPr>
+      </w:pPr>
+      <w:r>
+        <w:t xml:space="preserve">sidebar navigation behaviour </w:t>
+      </w:r>
+    </w:p>
+    <w:p>
+      <w:pPr>
+        <w:numPr>
+          <w:ilvl w:val="1"/>
+          <w:numId w:val="22"/>
+        </w:numPr>
+      </w:pPr>
+      <w:r>
+        <w:t xml:space="preserve">don't over-engineer this before launch </w:t>
+      </w:r>
+    </w:p>
+    <w:p>
+      <w:pPr>
+        <w:numPr>
+          <w:ilvl w:val="0"/>
+          <w:numId w:val="22"/>
+        </w:numPr>
+      </w:pPr>
+      <w:r>
+        <w:rPr>
+          <w:b/>
+          <w:bCs/>
+        </w:rPr>
+        <w:t>Header</w:t>
+      </w:r>
+      <w:r>
+        <w:t xml:space="preserve"> </w:t>
+      </w:r>
+    </w:p>
+    <w:p>
+      <w:pPr>
+        <w:numPr>
+          <w:ilvl w:val="1"/>
+          <w:numId w:val="22"/>
+        </w:numPr>
+      </w:pPr>
+      <w:r>
+        <w:t xml:space="preserve">remove/hide account icon </w:t>
+      </w:r>
+    </w:p>
+    <w:p>
+      <w:pPr>
+        <w:numPr>
+          <w:ilvl w:val="1"/>
+          <w:numId w:val="22"/>
+        </w:numPr>
+      </w:pPr>
+      <w:r>
+        <w:lastRenderedPageBreak/>
+        <w:t xml:space="preserve">search </w:t>
+      </w:r>
+    </w:p>
+    <w:p>
+      <w:pPr>
+        <w:numPr>
+          <w:ilvl w:val="1"/>
+          <w:numId w:val="22"/>
+        </w:numPr>
+      </w:pPr>
+      <w:r>
+        <w:t xml:space="preserve">logo </w:t>
+      </w:r>
+    </w:p>
+    <w:p>
+      <w:pPr>
+        <w:numPr>
+          <w:ilvl w:val="1"/>
+          <w:numId w:val="22"/>
+        </w:numPr>
+      </w:pPr>
+      <w:r>
+        <w:t xml:space="preserve">breadcrumbs </w:t>
+      </w:r>
+    </w:p>
+    <w:p>
+      <w:pPr>
+        <w:numPr>
+          <w:ilvl w:val="0"/>
+          <w:numId w:val="22"/>
+        </w:numPr>
+      </w:pPr>
+      <w:r>
+        <w:rPr>
+          <w:b/>
+          <w:bCs/>
+        </w:rPr>
+        <w:t>Footer</w:t>
+      </w:r>
+      <w:r>
+        <w:t xml:space="preserve"> </w:t>
+      </w:r>
+    </w:p>
+    <w:p>
+      <w:pPr>
+        <w:numPr>
+          <w:ilvl w:val="1"/>
+          <w:numId w:val="22"/>
+        </w:numPr>
+      </w:pPr>
+      <w:r>
+        <w:t xml:space="preserve">remove the unwanted sidebar/right-panel footer </w:t>
+      </w:r>
+    </w:p>
+    <w:p>
+      <w:pPr>
+        <w:numPr>
+          <w:ilvl w:val="1"/>
+          <w:numId w:val="22"/>
+        </w:numPr>
+      </w:pPr>
+      <w:r>
+        <w:t xml:space="preserve">landing pages footer at bottom </w:t>
+      </w:r>
+    </w:p>
+    <w:p>
+      <w:pPr>
+        <w:numPr>
+          <w:ilvl w:val="1"/>
+          <w:numId w:val="22"/>
+        </w:numPr>
+      </w:pPr>
+      <w:r>
+        <w:t xml:space="preserve">final footer content </w:t>
+      </w:r>
+    </w:p>
+    <w:p>
+      <w:pPr>
+        <w:numPr>
+          <w:ilvl w:val="0"/>
+          <w:numId w:val="22"/>
+        </w:numPr>
+      </w:pPr>
+      <w:r>
+        <w:rPr>
+          <w:b/>
+          <w:bCs/>
+        </w:rPr>
+        <w:t>Landing pages</w:t>
+      </w:r>
+    </w:p>
+    <w:p>
+      <w:pPr>
+        <w:numPr>
+          <w:ilvl w:val="1"/>
+          <w:numId w:val="22"/>
+        </w:numPr>
+      </w:pPr>
+      <w:r>
+        <w:t xml:space="preserve">Home </w:t>
+      </w:r>
+    </w:p>
+    <w:p>
+      <w:pPr>
+        <w:numPr>
+          <w:ilvl w:val="1"/>
+          <w:numId w:val="22"/>
+        </w:numPr>
+      </w:pPr>
+      <w:r>
+        <w:t xml:space="preserve">IAS </w:t>
+      </w:r>
+    </w:p>
+    <w:p>
+      <w:pPr>
+        <w:numPr>
+          <w:ilvl w:val="1"/>
+          <w:numId w:val="22"/>
+        </w:numPr>
+      </w:pPr>
+      <w:r>
+        <w:t xml:space="preserve">IFRS </w:t>
+      </w:r>
+    </w:p>
+    <w:p>
+      <w:pPr>
+        <w:numPr>
+          <w:ilvl w:val="1"/>
+          <w:numId w:val="22"/>
+        </w:numPr>
+      </w:pPr>
+      <w:r>
+        <w:t xml:space="preserve">IPSAS </w:t>
+      </w:r>
+    </w:p>
+    <w:p>
+      <w:pPr>
+        <w:numPr>
+          <w:ilvl w:val="1"/>
+          <w:numId w:val="22"/>
+        </w:numPr>
+      </w:pPr>
+      <w:r>
+        <w:t xml:space="preserve">Ind AS </w:t>
+      </w:r>
+    </w:p>
+    <w:p>
+      <w:pPr>
+        <w:numPr>
+          <w:ilvl w:val="1"/>
+          <w:numId w:val="22"/>
+        </w:numPr>
+      </w:pPr>
+      <w:r>
+        <w:t xml:space="preserve">US GAAP </w:t>
+      </w:r>
+    </w:p>
+    <w:p>
+      <w:pPr>
+        <w:numPr>
+          <w:ilvl w:val="1"/>
+          <w:numId w:val="22"/>
+        </w:numPr>
+      </w:pPr>
+      <w:r>
+        <w:t xml:space="preserve">UK GAAP </w:t>
+      </w:r>
+    </w:p>
+    <w:p>
+      <w:pPr>
+        <w:numPr>
+          <w:ilvl w:val="1"/>
+          <w:numId w:val="22"/>
+        </w:numPr>
+      </w:pPr>
+      <w:r>
+        <w:t xml:space="preserve">ASBE </w:t>
+      </w:r>
+    </w:p>
+    <w:p>
+      <w:pPr>
+        <w:numPr>
+          <w:ilvl w:val="1"/>
+          <w:numId w:val="22"/>
+        </w:numPr>
+      </w:pPr>
+      <w:r>
+        <w:t xml:space="preserve">ASPE </w:t>
+      </w:r>
+    </w:p>
+    <w:p>
+      <w:pPr>
+        <w:numPr>
+          <w:ilvl w:val="1"/>
+          <w:numId w:val="22"/>
+        </w:numPr>
+      </w:pPr>
+      <w:r>
+        <w:t xml:space="preserve">HGB </w:t>
+      </w:r>
+    </w:p>
+    <w:p>
+      <w:r>
+        <w:t>We don't need pixel-perfect redesign; just make sure they are coherent and functional.</w:t>
+      </w:r>
+    </w:p>
+    <w:p>
+      <w:pPr>
+        <w:rPr>
+          <w:b/>
+          <w:bCs/>
+        </w:rPr>
+      </w:pPr>
+      <w:r>
+        <w:rPr>
+          <w:b/>
+          <w:bCs/>
+        </w:rPr>
+        <w:t>Phase C — Release validation</w:t>
+      </w:r>
+    </w:p>
+    <w:p>
+      <w:r>
+        <w:t xml:space="preserve">Then do a </w:t>
+      </w:r>
+      <w:r>
+        <w:rPr>
+          <w:b/>
+          <w:bCs/>
+        </w:rPr>
+        <w:t>final automated audit</w:t>
+      </w:r>
+      <w:r>
+        <w:t>:</w:t>
+      </w:r>
+    </w:p>
+    <w:p>
+      <w:pPr>
+        <w:numPr>
+          <w:ilvl w:val="0"/>
+          <w:numId w:val="23"/>
+        </w:numPr>
+      </w:pPr>
+      <w:r>
+        <w:t xml:space="preserve">broken routes </w:t>
+      </w:r>
+    </w:p>
+    <w:p>
+      <w:pPr>
+        <w:numPr>
+          <w:ilvl w:val="0"/>
+          <w:numId w:val="23"/>
+        </w:numPr>
+      </w:pPr>
+      <w:r>
+        <w:t xml:space="preserve">duplicate IDs </w:t>
+      </w:r>
+    </w:p>
+    <w:p>
+      <w:pPr>
+        <w:numPr>
+          <w:ilvl w:val="0"/>
+          <w:numId w:val="23"/>
+        </w:numPr>
+      </w:pPr>
+      <w:r>
+        <w:t xml:space="preserve">missing TOC anchors </w:t>
+      </w:r>
+    </w:p>
+    <w:p>
+      <w:pPr>
+        <w:numPr>
+          <w:ilvl w:val="0"/>
+          <w:numId w:val="23"/>
+        </w:numPr>
+      </w:pPr>
+      <w:r>
+        <w:t xml:space="preserve">missing metadata </w:t>
+      </w:r>
+    </w:p>
+    <w:p>
+      <w:pPr>
+        <w:numPr>
+          <w:ilvl w:val="0"/>
+          <w:numId w:val="23"/>
+        </w:numPr>
+      </w:pPr>
+      <w:r>
+        <w:t xml:space="preserve">malformed HTML </w:t>
+      </w:r>
+    </w:p>
+    <w:p>
+      <w:pPr>
+        <w:numPr>
+          <w:ilvl w:val="0"/>
+          <w:numId w:val="23"/>
+        </w:numPr>
+      </w:pPr>
+      <w:r>
+        <w:t xml:space="preserve">build </w:t>
+      </w:r>
+    </w:p>
+    <w:p>
+      <w:pPr>
+        <w:numPr>
+          <w:ilvl w:val="0"/>
+          <w:numId w:val="23"/>
+        </w:numPr>
+      </w:pPr>
+      <w:r>
+        <w:t xml:space="preserve">framework configuration </w:t>
+      </w:r>
+    </w:p>
+    <w:p>
+      <w:pPr>
+        <w:numPr>
+          <w:ilvl w:val="0"/>
+          <w:numId w:val="23"/>
+        </w:numPr>
+      </w:pPr>
+      <w:r>
+        <w:t xml:space="preserve">accidental drs framework </w:t>
+      </w:r>
+    </w:p>
+    <w:p>
+      <w:pPr>
+        <w:numPr>
+          <w:ilvl w:val="0"/>
+          <w:numId w:val="23"/>
+        </w:numPr>
+      </w:pPr>
+      <w:r>
+        <w:t xml:space="preserve">accidental </w:t>
+      </w:r>
+      <w:proofErr w:type="spellStart"/>
+      <w:r>
+        <w:t>japangaap</w:t>
+      </w:r>
+      <w:proofErr w:type="spellEnd"/>
+      <w:r>
+        <w:t xml:space="preserve"> </w:t>
+      </w:r>
+    </w:p>
+    <w:p>
+      <w:pPr>
+        <w:numPr>
+          <w:ilvl w:val="0"/>
+          <w:numId w:val="23"/>
+        </w:numPr>
+      </w:pPr>
+      <w:r>
+        <w:t xml:space="preserve">missing sidebar entries </w:t>
+      </w:r>
+    </w:p>
+    <w:p>
+      <w:pPr>
+        <w:numPr>
+          <w:ilvl w:val="0"/>
+          <w:numId w:val="23"/>
+        </w:numPr>
+      </w:pPr>
+      <w:r>
+        <w:t xml:space="preserve">missing pages referenced in </w:t>
+      </w:r>
+      <w:proofErr w:type="spellStart"/>
+      <w:proofErr w:type="gramStart"/>
+      <w:r>
+        <w:t>standards.json</w:t>
+      </w:r>
+      <w:proofErr w:type="spellEnd"/>
+      <w:proofErr w:type="gramEnd"/>
+      <w:r>
+        <w:t xml:space="preserve"> </w:t>
+      </w:r>
+    </w:p>
+    <w:p>
+      <w:r>
+        <w:t>Then:</w:t>
+      </w:r>
+    </w:p>
+    <w:p>
+      <w:proofErr w:type="spellStart"/>
+      <w:r>
+        <w:rPr>
+          <w:b/>
+          <w:bCs/>
+        </w:rPr>
+        <w:t>npm</w:t>
+      </w:r>
+      <w:proofErr w:type="spellEnd"/>
+      <w:r>
+        <w:rPr>
+          <w:b/>
+          <w:bCs/>
+        </w:rPr>
+        <w:t xml:space="preserve"> run build → zero errors → final manual smoke test → publish.</w:t>
+      </w:r>
+    </w:p>
+    <w:p>
+      <w:pPr>
+        <w:rPr>
+          <w:b/>
+          <w:bCs/>
+        </w:rPr>
+      </w:pPr>
+      <w:r>
+        <w:rPr>
+          <w:b/>
+          <w:bCs/>
+        </w:rPr>
+        <w:lastRenderedPageBreak/>
+        <w:t>Phase D — Post-launch</w:t>
+      </w:r>
+    </w:p>
+    <w:p>
+      <w:r>
+        <w:t>After the site is live, we can resume the backlog:</w:t>
+      </w:r>
+    </w:p>
+    <w:p>
+      <w:pPr>
+        <w:numPr>
+          <w:ilvl w:val="0"/>
+          <w:numId w:val="24"/>
+        </w:numPr>
+      </w:pPr>
+      <w:r>
+        <w:t xml:space="preserve">ASBJ full page QA </w:t>
+      </w:r>
+    </w:p>
+    <w:p>
+      <w:pPr>
+        <w:numPr>
+          <w:ilvl w:val="0"/>
+          <w:numId w:val="24"/>
+        </w:numPr>
+      </w:pPr>
+      <w:r>
+        <w:t xml:space="preserve">IPSAS full visual/content QA </w:t>
+      </w:r>
+    </w:p>
+    <w:p>
+      <w:pPr>
+        <w:numPr>
+          <w:ilvl w:val="0"/>
+          <w:numId w:val="24"/>
+        </w:numPr>
+      </w:pPr>
+      <w:r>
+        <w:t xml:space="preserve">HGB/DRS deeper visual QA </w:t>
+      </w:r>
+    </w:p>
+    <w:p>
+      <w:pPr>
+        <w:numPr>
+          <w:ilvl w:val="0"/>
+          <w:numId w:val="24"/>
+        </w:numPr>
+      </w:pPr>
+      <w:r>
+        <w:t xml:space="preserve">Japan/ASBJ rail re-enable </w:t>
+      </w:r>
+    </w:p>
+    <w:p>
+      <w:pPr>
+        <w:numPr>
+          <w:ilvl w:val="0"/>
+          <w:numId w:val="24"/>
+        </w:numPr>
+      </w:pPr>
+      <w:r>
+        <w:t xml:space="preserve">Content-position JS </w:t>
+      </w:r>
+    </w:p>
+    <w:p>
+      <w:pPr>
+        <w:numPr>
+          <w:ilvl w:val="0"/>
+          <w:numId w:val="24"/>
+        </w:numPr>
+      </w:pPr>
+      <w:r>
+        <w:t xml:space="preserve">Sidebar scroll-position persistence </w:t>
+      </w:r>
+    </w:p>
+    <w:p>
+      <w:pPr>
+        <w:numPr>
+          <w:ilvl w:val="0"/>
+          <w:numId w:val="24"/>
+        </w:numPr>
+      </w:pPr>
+      <w:r>
+        <w:t xml:space="preserve">TOC improvements </w:t>
+      </w:r>
+    </w:p>
+    <w:p>
+      <w:pPr>
+        <w:numPr>
+          <w:ilvl w:val="0"/>
+          <w:numId w:val="24"/>
+        </w:numPr>
+      </w:pPr>
+      <w:r>
+        <w:t xml:space="preserve">Global search refinement </w:t>
+      </w:r>
+    </w:p>
+    <w:p>
+      <w:pPr>
+        <w:numPr>
+          <w:ilvl w:val="0"/>
+          <w:numId w:val="24"/>
+        </w:numPr>
+      </w:pPr>
+      <w:r>
+        <w:t xml:space="preserve">Landing-page improvements </w:t>
+      </w:r>
+    </w:p>
+    <w:p>
+      <w:pPr>
+        <w:numPr>
+          <w:ilvl w:val="0"/>
+          <w:numId w:val="24"/>
+        </w:numPr>
+      </w:pPr>
+      <w:r>
+        <w:t xml:space="preserve">Buy Me a Coffee / Chai4.me / </w:t>
+      </w:r>
+      <w:proofErr w:type="spellStart"/>
+      <w:r>
+        <w:t>OnlyChai</w:t>
+      </w:r>
+      <w:proofErr w:type="spellEnd"/>
+      <w:r>
+        <w:t xml:space="preserve"> / PayPal </w:t>
+      </w:r>
+    </w:p>
+    <w:p>
+      <w:pPr>
+        <w:numPr>
+          <w:ilvl w:val="0"/>
+          <w:numId w:val="24"/>
+        </w:numPr>
+      </w:pPr>
+      <w:r>
+        <w:t xml:space="preserve">Google AdSense </w:t>
+      </w:r>
+    </w:p>
+    <w:p>
+      <w:pPr>
+        <w:numPr>
+          <w:ilvl w:val="0"/>
+          <w:numId w:val="24"/>
+        </w:numPr>
+      </w:pPr>
+      <w:r>
+        <w:t xml:space="preserve">Further visual polish </w:t>
+      </w:r>
+    </w:p>
+    <w:p>
+      <w:r>
+        <w:rPr>
+          <w:b/>
+          <w:bCs/>
+        </w:rPr>
+        <w:t xml:space="preserve">The key now </w:t>
+      </w:r>
+      <w:proofErr w:type="gramStart"/>
+      <w:r>
+        <w:rPr>
+          <w:b/>
+          <w:bCs/>
+        </w:rPr>
+        <w:t>is:</w:t>
+      </w:r>
+      <w:proofErr w:type="gramEnd"/>
+      <w:r>
+        <w:rPr>
+          <w:b/>
+          <w:bCs/>
+        </w:rPr>
+        <w:t xml:space="preserve"> don't let "perfect" prevent us from getting a stable v1 published.</w:t>
+      </w:r>
+      <w:r>
+        <w:t xml:space="preserve"> We already have a very substantial site; tomorrow's goal should be a reliable launch, not finishing every possible enhancement.</w:t>
+      </w:r>
+    </w:p>
+    <w:p>
+      <w:r>
+        <w:br w:type="page"/>
+      </w:r>
+    </w:p>
+    <w:p>
+      <w:pPr>
         <w:spacing w:after="0"/>
         <w:rPr>
           <w:rFonts w:ascii="Aptos Mono" w:hAnsi="Aptos Mono"/>
@@ -4898,35 +5921,218 @@
           <w:rFonts w:ascii="Aptos Mono" w:hAnsi="Aptos Mono"/>
         </w:rPr>
         <w:lastRenderedPageBreak/>
-        <w:t xml:space="preserve">    &lt;div class="card ci"&gt;</w:t>
-      </w:r>
-    </w:p>
-    <w:p>
-      <w:pPr>
-        <w:spacing w:after="0"/>
+        <w:t xml:space="preserve">    </w:t>
+      </w:r>
+      <w:r>
         <w:rPr>
           <w:rFonts w:ascii="Aptos Mono" w:hAnsi="Aptos Mono"/>
-        </w:rPr>
-      </w:pPr>
-      <w:r>
+          <w:b/>
+          <w:bCs/>
+        </w:rPr>
+        <w:t>P0 — Must work before publishing</w:t>
+      </w:r>
+    </w:p>
+    <w:p>
+      <w:pPr>
+        <w:numPr>
+          <w:ilvl w:val="0"/>
+          <w:numId w:val="25"/>
+        </w:numPr>
+        <w:spacing w:after="0"/>
         <w:rPr>
           <w:rFonts w:ascii="Aptos Mono" w:hAnsi="Aptos Mono"/>
         </w:rPr>
-        <w:t xml:space="preserve">        &lt;div class="</w:t>
+      </w:pPr>
+      <w:r>
+        <w:rPr>
+          <w:rFonts w:ascii="Aptos Mono" w:hAnsi="Aptos Mono"/>
+        </w:rPr>
+        <w:t xml:space="preserve">Framework Rail and framework switching </w:t>
+      </w:r>
+    </w:p>
+    <w:p>
+      <w:pPr>
+        <w:numPr>
+          <w:ilvl w:val="0"/>
+          <w:numId w:val="25"/>
+        </w:numPr>
+        <w:spacing w:after="0"/>
+        <w:rPr>
+          <w:rFonts w:ascii="Aptos Mono" w:hAnsi="Aptos Mono"/>
+        </w:rPr>
+      </w:pPr>
+      <w:r>
+        <w:rPr>
+          <w:rFonts w:ascii="Aptos Mono" w:hAnsi="Aptos Mono"/>
+        </w:rPr>
+        <w:t xml:space="preserve">Sidebar visibility/navigation </w:t>
+      </w:r>
+    </w:p>
+    <w:p>
+      <w:pPr>
+        <w:numPr>
+          <w:ilvl w:val="0"/>
+          <w:numId w:val="25"/>
+        </w:numPr>
+        <w:spacing w:after="0"/>
+        <w:rPr>
+          <w:rFonts w:ascii="Aptos Mono" w:hAnsi="Aptos Mono"/>
+        </w:rPr>
+      </w:pPr>
+      <w:r>
+        <w:rPr>
+          <w:rFonts w:ascii="Aptos Mono" w:hAnsi="Aptos Mono"/>
+        </w:rPr>
+        <w:t xml:space="preserve">TOC and section anchors </w:t>
+      </w:r>
+    </w:p>
+    <w:p>
+      <w:pPr>
+        <w:numPr>
+          <w:ilvl w:val="0"/>
+          <w:numId w:val="25"/>
+        </w:numPr>
+        <w:spacing w:after="0"/>
+        <w:rPr>
+          <w:rFonts w:ascii="Aptos Mono" w:hAnsi="Aptos Mono"/>
+        </w:rPr>
+      </w:pPr>
+      <w:r>
+        <w:rPr>
+          <w:rFonts w:ascii="Aptos Mono" w:hAnsi="Aptos Mono"/>
+        </w:rPr>
+        <w:t xml:space="preserve">Previous/Next navigation </w:t>
+      </w:r>
+    </w:p>
+    <w:p>
+      <w:pPr>
+        <w:numPr>
+          <w:ilvl w:val="0"/>
+          <w:numId w:val="25"/>
+        </w:numPr>
+        <w:spacing w:after="0"/>
+        <w:rPr>
+          <w:rFonts w:ascii="Aptos Mono" w:hAnsi="Aptos Mono"/>
+        </w:rPr>
+      </w:pPr>
+      <w:r>
+        <w:rPr>
+          <w:rFonts w:ascii="Aptos Mono" w:hAnsi="Aptos Mono"/>
+        </w:rPr>
+        <w:t xml:space="preserve">Global search basic functionality </w:t>
+      </w:r>
+    </w:p>
+    <w:p>
+      <w:pPr>
+        <w:numPr>
+          <w:ilvl w:val="0"/>
+          <w:numId w:val="25"/>
+        </w:numPr>
+        <w:spacing w:after="0"/>
+        <w:rPr>
+          <w:rFonts w:ascii="Aptos Mono" w:hAnsi="Aptos Mono"/>
+        </w:rPr>
+      </w:pPr>
+      <w:r>
+        <w:rPr>
+          <w:rFonts w:ascii="Aptos Mono" w:hAnsi="Aptos Mono"/>
+        </w:rPr>
+        <w:t xml:space="preserve">Header cleanup — account icon </w:t>
+      </w:r>
+    </w:p>
+    <w:p>
+      <w:pPr>
+        <w:numPr>
+          <w:ilvl w:val="0"/>
+          <w:numId w:val="25"/>
+        </w:numPr>
+        <w:spacing w:after="0"/>
+        <w:rPr>
+          <w:rFonts w:ascii="Aptos Mono" w:hAnsi="Aptos Mono"/>
+        </w:rPr>
+      </w:pPr>
+      <w:r>
+        <w:rPr>
+          <w:rFonts w:ascii="Aptos Mono" w:hAnsi="Aptos Mono"/>
+        </w:rPr>
+        <w:t xml:space="preserve">Footer cleanup and bottom positioning </w:t>
+      </w:r>
+    </w:p>
+    <w:p>
+      <w:pPr>
+        <w:numPr>
+          <w:ilvl w:val="0"/>
+          <w:numId w:val="25"/>
+        </w:numPr>
+        <w:spacing w:after="0"/>
+        <w:rPr>
+          <w:rFonts w:ascii="Aptos Mono" w:hAnsi="Aptos Mono"/>
+        </w:rPr>
+      </w:pPr>
+      <w:r>
+        <w:rPr>
+          <w:rFonts w:ascii="Aptos Mono" w:hAnsi="Aptos Mono"/>
+        </w:rPr>
+        <w:t xml:space="preserve">Broken routes/build/metadata audit </w:t>
+      </w:r>
+    </w:p>
+    <w:p>
+      <w:pPr>
+        <w:numPr>
+          <w:ilvl w:val="0"/>
+          <w:numId w:val="25"/>
+        </w:numPr>
+        <w:spacing w:after="0"/>
+        <w:rPr>
+          <w:rFonts w:ascii="Aptos Mono" w:hAnsi="Aptos Mono"/>
+        </w:rPr>
+      </w:pPr>
+      <w:r>
+        <w:rPr>
+          <w:rFonts w:ascii="Aptos Mono" w:hAnsi="Aptos Mono"/>
+          <w:b/>
+          <w:bCs/>
+          <w:highlight w:val="yellow"/>
+        </w:rPr>
+        <w:t>Move IFRS sub-frameworks into the IFRS structure</w:t>
+      </w:r>
+      <w:r>
+        <w:rPr>
+          <w:rFonts w:ascii="Aptos Mono" w:hAnsi="Aptos Mono"/>
+        </w:rPr>
+        <w:t xml:space="preserve"> </w:t>
+      </w:r>
+    </w:p>
+    <w:p>
+      <w:pPr>
+        <w:numPr>
+          <w:ilvl w:val="0"/>
+          <w:numId w:val="25"/>
+        </w:numPr>
+        <w:spacing w:after="0"/>
+        <w:rPr>
+          <w:rFonts w:ascii="Aptos Mono" w:hAnsi="Aptos Mono"/>
+        </w:rPr>
+      </w:pPr>
+      <w:r>
+        <w:rPr>
+          <w:rFonts w:ascii="Aptos Mono" w:hAnsi="Aptos Mono"/>
+        </w:rPr>
+        <w:t xml:space="preserve">Final smoke test + </w:t>
       </w:r>
       <w:proofErr w:type="spellStart"/>
       <w:r>
         <w:rPr>
           <w:rFonts w:ascii="Aptos Mono" w:hAnsi="Aptos Mono"/>
         </w:rPr>
-        <w:t>ctitle</w:t>
+        <w:t>npm</w:t>
       </w:r>
       <w:proofErr w:type="spellEnd"/>
       <w:r>
         <w:rPr>
           <w:rFonts w:ascii="Aptos Mono" w:hAnsi="Aptos Mono"/>
         </w:rPr>
-        <w:t xml:space="preserve"> ci"&gt;Objective &amp;amp; scope&lt;/div&gt;</w:t>
+        <w:t xml:space="preserve"> run build </w:t>
       </w:r>
     </w:p>
     <w:p>
@@ -4939,12 +6145,18 @@
       <w:r>
         <w:rPr>
           <w:rFonts w:ascii="Aptos Mono" w:hAnsi="Aptos Mono"/>
-        </w:rPr>
-        <w:t xml:space="preserve">        &lt;div class="principle"&gt;</w:t>
-      </w:r>
-    </w:p>
-    <w:p>
-      <w:pPr>
+          <w:b/>
+          <w:bCs/>
+        </w:rPr>
+        <w:t>P1 — Nice to have if time permits</w:t>
+      </w:r>
+    </w:p>
+    <w:p>
+      <w:pPr>
+        <w:numPr>
+          <w:ilvl w:val="0"/>
+          <w:numId w:val="26"/>
+        </w:numPr>
         <w:spacing w:after="0"/>
         <w:rPr>
           <w:rFonts w:ascii="Aptos Mono" w:hAnsi="Aptos Mono"/>
@@ -4954,11 +6166,15 @@
         <w:rPr>
           <w:rFonts w:ascii="Aptos Mono" w:hAnsi="Aptos Mono"/>
         </w:rPr>
-        <w:t xml:space="preserve">            Prescribes financial reporting requirements for revenue arising from NON-EXCHANGE transactions — other than</w:t>
-      </w:r>
-    </w:p>
-    <w:p>
-      <w:pPr>
+        <w:t xml:space="preserve">Sidebar scroll-position memory </w:t>
+      </w:r>
+    </w:p>
+    <w:p>
+      <w:pPr>
+        <w:numPr>
+          <w:ilvl w:val="0"/>
+          <w:numId w:val="26"/>
+        </w:numPr>
         <w:spacing w:after="0"/>
         <w:rPr>
           <w:rFonts w:ascii="Aptos Mono" w:hAnsi="Aptos Mono"/>
@@ -4968,11 +6184,15 @@
         <w:rPr>
           <w:rFonts w:ascii="Aptos Mono" w:hAnsi="Aptos Mono"/>
         </w:rPr>
-        <w:t xml:space="preserve">            those giving rise to a public sector combination. Covers recognizing and measuring such revenue, including</w:t>
-      </w:r>
-    </w:p>
-    <w:p>
-      <w:pPr>
+        <w:t xml:space="preserve">Content-position behaviour for sidebar navigation </w:t>
+      </w:r>
+    </w:p>
+    <w:p>
+      <w:pPr>
+        <w:numPr>
+          <w:ilvl w:val="0"/>
+          <w:numId w:val="26"/>
+        </w:numPr>
         <w:spacing w:after="0"/>
         <w:rPr>
           <w:rFonts w:ascii="Aptos Mono" w:hAnsi="Aptos Mono"/>
@@ -4982,11 +6202,15 @@
         <w:rPr>
           <w:rFonts w:ascii="Aptos Mono" w:hAnsi="Aptos Mono"/>
         </w:rPr>
-        <w:t xml:space="preserve">            identifying contributions from owners.</w:t>
-      </w:r>
-    </w:p>
-    <w:p>
-      <w:pPr>
+        <w:t xml:space="preserve">TOC scroll synchronisation improvements </w:t>
+      </w:r>
+    </w:p>
+    <w:p>
+      <w:pPr>
+        <w:numPr>
+          <w:ilvl w:val="0"/>
+          <w:numId w:val="26"/>
+        </w:numPr>
         <w:spacing w:after="0"/>
         <w:rPr>
           <w:rFonts w:ascii="Aptos Mono" w:hAnsi="Aptos Mono"/>
@@ -4996,11 +6220,15 @@
         <w:rPr>
           <w:rFonts w:ascii="Aptos Mono" w:hAnsi="Aptos Mono"/>
         </w:rPr>
-        <w:t xml:space="preserve">        &lt;/div&gt;</w:t>
-      </w:r>
-    </w:p>
-    <w:p>
-      <w:pPr>
+        <w:t xml:space="preserve">Homepage/landing-page visual improvements </w:t>
+      </w:r>
+    </w:p>
+    <w:p>
+      <w:pPr>
+        <w:numPr>
+          <w:ilvl w:val="0"/>
+          <w:numId w:val="26"/>
+        </w:numPr>
         <w:spacing w:after="0"/>
         <w:rPr>
           <w:rFonts w:ascii="Aptos Mono" w:hAnsi="Aptos Mono"/>
@@ -5010,7 +6238,7 @@
         <w:rPr>
           <w:rFonts w:ascii="Aptos Mono" w:hAnsi="Aptos Mono"/>
         </w:rPr>
-        <w:t xml:space="preserve">        &lt;div class="cross-list"&gt;</w:t>
+        <w:t xml:space="preserve">Small visual inconsistencies </w:t>
       </w:r>
     </w:p>
     <w:p>
@@ -5023,26 +6251,36 @@
       <w:r>
         <w:rPr>
           <w:rFonts w:ascii="Aptos Mono" w:hAnsi="Aptos Mono"/>
-        </w:rPr>
-        <w:t xml:space="preserve">            &lt;span&gt;A public sector combination that is itself a non-exchange transaction (IPSAS </w:t>
-      </w:r>
-      <w:proofErr w:type="gramStart"/>
-      <w:r>
+          <w:b/>
+          <w:bCs/>
+        </w:rPr>
+        <w:t>Post-launch</w:t>
+      </w:r>
+    </w:p>
+    <w:p>
+      <w:pPr>
+        <w:numPr>
+          <w:ilvl w:val="0"/>
+          <w:numId w:val="27"/>
+        </w:numPr>
+        <w:spacing w:after="0"/>
         <w:rPr>
           <w:rFonts w:ascii="Aptos Mono" w:hAnsi="Aptos Mono"/>
         </w:rPr>
-        <w:t>40)&lt;</w:t>
-      </w:r>
-      <w:proofErr w:type="gramEnd"/>
+      </w:pPr>
       <w:r>
         <w:rPr>
           <w:rFonts w:ascii="Aptos Mono" w:hAnsi="Aptos Mono"/>
         </w:rPr>
-        <w:t>/span&gt;</w:t>
-      </w:r>
-    </w:p>
-    <w:p>
-      <w:pPr>
+        <w:t xml:space="preserve">ASBJ re-enable + full QA </w:t>
+      </w:r>
+    </w:p>
+    <w:p>
+      <w:pPr>
+        <w:numPr>
+          <w:ilvl w:val="0"/>
+          <w:numId w:val="27"/>
+        </w:numPr>
         <w:spacing w:after="0"/>
         <w:rPr>
           <w:rFonts w:ascii="Aptos Mono" w:hAnsi="Aptos Mono"/>
@@ -5052,25 +6290,33 @@
         <w:rPr>
           <w:rFonts w:ascii="Aptos Mono" w:hAnsi="Aptos Mono"/>
         </w:rPr>
-        <w:t xml:space="preserve">            &lt;span&gt;Contributions to social benefit schemes under the insurance approach (IPSAS 42, paras. 26–</w:t>
-      </w:r>
-      <w:proofErr w:type="gramStart"/>
-      <w:r>
+        <w:t xml:space="preserve">IPSAS detailed QA </w:t>
+      </w:r>
+    </w:p>
+    <w:p>
+      <w:pPr>
+        <w:numPr>
+          <w:ilvl w:val="0"/>
+          <w:numId w:val="27"/>
+        </w:numPr>
+        <w:spacing w:after="0"/>
         <w:rPr>
           <w:rFonts w:ascii="Aptos Mono" w:hAnsi="Aptos Mono"/>
         </w:rPr>
-        <w:t>31)&lt;</w:t>
-      </w:r>
-      <w:proofErr w:type="gramEnd"/>
+      </w:pPr>
       <w:r>
         <w:rPr>
           <w:rFonts w:ascii="Aptos Mono" w:hAnsi="Aptos Mono"/>
         </w:rPr>
-        <w:t>/span&gt;</w:t>
-      </w:r>
-    </w:p>
-    <w:p>
-      <w:pPr>
+        <w:t xml:space="preserve">Deeper HGB/DRS QA </w:t>
+      </w:r>
+    </w:p>
+    <w:p>
+      <w:pPr>
+        <w:numPr>
+          <w:ilvl w:val="0"/>
+          <w:numId w:val="27"/>
+        </w:numPr>
         <w:spacing w:after="0"/>
         <w:rPr>
           <w:rFonts w:ascii="Aptos Mono" w:hAnsi="Aptos Mono"/>
@@ -5080,11 +6326,15 @@
         <w:rPr>
           <w:rFonts w:ascii="Aptos Mono" w:hAnsi="Aptos Mono"/>
         </w:rPr>
-        <w:t xml:space="preserve">        &lt;/div&gt;</w:t>
-      </w:r>
-    </w:p>
-    <w:p>
-      <w:pPr>
+        <w:t xml:space="preserve">Search ranking/quality improvements </w:t>
+      </w:r>
+    </w:p>
+    <w:p>
+      <w:pPr>
+        <w:numPr>
+          <w:ilvl w:val="0"/>
+          <w:numId w:val="27"/>
+        </w:numPr>
         <w:spacing w:after="0"/>
         <w:rPr>
           <w:rFonts w:ascii="Aptos Mono" w:hAnsi="Aptos Mono"/>
@@ -5094,11 +6344,15 @@
         <w:rPr>
           <w:rFonts w:ascii="Aptos Mono" w:hAnsi="Aptos Mono"/>
         </w:rPr>
-        <w:t xml:space="preserve">        &lt;div class="note"&gt;</w:t>
-      </w:r>
-    </w:p>
-    <w:p>
-      <w:pPr>
+        <w:t xml:space="preserve">Contribution integrations </w:t>
+      </w:r>
+    </w:p>
+    <w:p>
+      <w:pPr>
+        <w:numPr>
+          <w:ilvl w:val="0"/>
+          <w:numId w:val="27"/>
+        </w:numPr>
         <w:spacing w:after="0"/>
         <w:rPr>
           <w:rFonts w:ascii="Aptos Mono" w:hAnsi="Aptos Mono"/>
@@ -5108,11 +6362,15 @@
         <w:rPr>
           <w:rFonts w:ascii="Aptos Mono" w:hAnsi="Aptos Mono"/>
         </w:rPr>
-        <w:t xml:space="preserve">            Sister standard: IPSAS 9 covers EXCHANGE transaction revenue. Together they cover most public sector</w:t>
-      </w:r>
-    </w:p>
-    <w:p>
-      <w:pPr>
+        <w:t xml:space="preserve">AdSense </w:t>
+      </w:r>
+    </w:p>
+    <w:p>
+      <w:pPr>
+        <w:numPr>
+          <w:ilvl w:val="0"/>
+          <w:numId w:val="27"/>
+        </w:numPr>
         <w:spacing w:after="0"/>
         <w:rPr>
           <w:rFonts w:ascii="Aptos Mono" w:hAnsi="Aptos Mono"/>
@@ -5122,7 +6380,7 @@
         <w:rPr>
           <w:rFonts w:ascii="Aptos Mono" w:hAnsi="Aptos Mono"/>
         </w:rPr>
-        <w:t xml:space="preserve">            revenue, pending IPSAS 47's eventual broader rollout.</w:t>
+        <w:t>General visual polish</w:t>
       </w:r>
     </w:p>
     <w:p>
@@ -5132,983 +6390,6 @@
           <w:rFonts w:ascii="Aptos Mono" w:hAnsi="Aptos Mono"/>
         </w:rPr>
       </w:pPr>
-      <w:r>
-        <w:rPr>
-          <w:rFonts w:ascii="Aptos Mono" w:hAnsi="Aptos Mono"/>
-        </w:rPr>
-        <w:t xml:space="preserve">        &lt;/div&gt;</w:t>
-      </w:r>
-    </w:p>
-    <w:p>
-      <w:pPr>
-        <w:spacing w:after="0"/>
-        <w:rPr>
-          <w:rFonts w:ascii="Aptos Mono" w:hAnsi="Aptos Mono"/>
-        </w:rPr>
-      </w:pPr>
-      <w:r>
-        <w:rPr>
-          <w:rFonts w:ascii="Aptos Mono" w:hAnsi="Aptos Mono"/>
-        </w:rPr>
-        <w:t xml:space="preserve">    &lt;/div&gt;</w:t>
-      </w:r>
-    </w:p>
-    <w:p>
-      <w:pPr>
-        <w:spacing w:after="0"/>
-        <w:rPr>
-          <w:rFonts w:ascii="Aptos Mono" w:hAnsi="Aptos Mono"/>
-        </w:rPr>
-      </w:pPr>
-      <w:r>
-        <w:rPr>
-          <w:rFonts w:ascii="Aptos Mono" w:hAnsi="Aptos Mono"/>
-        </w:rPr>
-        <w:t xml:space="preserve">    &lt;div class="card cd"&gt;</w:t>
-      </w:r>
-    </w:p>
-    <w:p>
-      <w:pPr>
-        <w:spacing w:after="0"/>
-        <w:rPr>
-          <w:rFonts w:ascii="Aptos Mono" w:hAnsi="Aptos Mono"/>
-        </w:rPr>
-      </w:pPr>
-      <w:r>
-        <w:rPr>
-          <w:rFonts w:ascii="Aptos Mono" w:hAnsi="Aptos Mono"/>
-        </w:rPr>
-        <w:t xml:space="preserve">        &lt;div class="</w:t>
-      </w:r>
-      <w:proofErr w:type="spellStart"/>
-      <w:r>
-        <w:rPr>
-          <w:rFonts w:ascii="Aptos Mono" w:hAnsi="Aptos Mono"/>
-        </w:rPr>
-        <w:t>ctitle</w:t>
-      </w:r>
-      <w:proofErr w:type="spellEnd"/>
-      <w:r>
-        <w:rPr>
-          <w:rFonts w:ascii="Aptos Mono" w:hAnsi="Aptos Mono"/>
-        </w:rPr>
-        <w:t xml:space="preserve"> cd"&gt;Key definitions (para. 7)&lt;/div&gt;</w:t>
-      </w:r>
-    </w:p>
-    <w:p>
-      <w:pPr>
-        <w:spacing w:after="0"/>
-        <w:rPr>
-          <w:rFonts w:ascii="Aptos Mono" w:hAnsi="Aptos Mono"/>
-        </w:rPr>
-      </w:pPr>
-      <w:r>
-        <w:rPr>
-          <w:rFonts w:ascii="Aptos Mono" w:hAnsi="Aptos Mono"/>
-        </w:rPr>
-        <w:t xml:space="preserve">        &lt;div class="glossary-item"&gt;</w:t>
-      </w:r>
-    </w:p>
-    <w:p>
-      <w:pPr>
-        <w:spacing w:after="0"/>
-        <w:rPr>
-          <w:rFonts w:ascii="Aptos Mono" w:hAnsi="Aptos Mono"/>
-        </w:rPr>
-      </w:pPr>
-      <w:r>
-        <w:rPr>
-          <w:rFonts w:ascii="Aptos Mono" w:hAnsi="Aptos Mono"/>
-        </w:rPr>
-        <w:t xml:space="preserve">            &lt;div class="glossary-term"&gt;Taxes&lt;/div&gt;</w:t>
-      </w:r>
-    </w:p>
-    <w:p>
-      <w:pPr>
-        <w:spacing w:after="0"/>
-        <w:rPr>
-          <w:rFonts w:ascii="Aptos Mono" w:hAnsi="Aptos Mono"/>
-        </w:rPr>
-      </w:pPr>
-      <w:r>
-        <w:rPr>
-          <w:rFonts w:ascii="Aptos Mono" w:hAnsi="Aptos Mono"/>
-        </w:rPr>
-        <w:t xml:space="preserve">            &lt;div class="glossary-def"&gt;</w:t>
-      </w:r>
-    </w:p>
-    <w:p>
-      <w:pPr>
-        <w:spacing w:after="0"/>
-        <w:rPr>
-          <w:rFonts w:ascii="Aptos Mono" w:hAnsi="Aptos Mono"/>
-        </w:rPr>
-      </w:pPr>
-      <w:r>
-        <w:rPr>
-          <w:rFonts w:ascii="Aptos Mono" w:hAnsi="Aptos Mono"/>
-        </w:rPr>
-        <w:t xml:space="preserve">                Economic benefits/service potential compulsorily paid or payable to public sector entities, per</w:t>
-      </w:r>
-    </w:p>
-    <w:p>
-      <w:pPr>
-        <w:spacing w:after="0"/>
-        <w:rPr>
-          <w:rFonts w:ascii="Aptos Mono" w:hAnsi="Aptos Mono"/>
-        </w:rPr>
-      </w:pPr>
-      <w:r>
-        <w:rPr>
-          <w:rFonts w:ascii="Aptos Mono" w:hAnsi="Aptos Mono"/>
-        </w:rPr>
-        <w:t xml:space="preserve">                laws/regulations established to provide government revenue — EXCLUDING fines or other penalties.</w:t>
-      </w:r>
-    </w:p>
-    <w:p>
-      <w:pPr>
-        <w:spacing w:after="0"/>
-        <w:rPr>
-          <w:rFonts w:ascii="Aptos Mono" w:hAnsi="Aptos Mono"/>
-        </w:rPr>
-      </w:pPr>
-      <w:r>
-        <w:rPr>
-          <w:rFonts w:ascii="Aptos Mono" w:hAnsi="Aptos Mono"/>
-        </w:rPr>
-        <w:t xml:space="preserve">            &lt;/div&gt;</w:t>
-      </w:r>
-    </w:p>
-    <w:p>
-      <w:pPr>
-        <w:spacing w:after="0"/>
-        <w:rPr>
-          <w:rFonts w:ascii="Aptos Mono" w:hAnsi="Aptos Mono"/>
-        </w:rPr>
-      </w:pPr>
-      <w:r>
-        <w:rPr>
-          <w:rFonts w:ascii="Aptos Mono" w:hAnsi="Aptos Mono"/>
-        </w:rPr>
-        <w:t xml:space="preserve">        &lt;/div&gt;</w:t>
-      </w:r>
-    </w:p>
-    <w:p>
-      <w:pPr>
-        <w:spacing w:after="0"/>
-        <w:rPr>
-          <w:rFonts w:ascii="Aptos Mono" w:hAnsi="Aptos Mono"/>
-        </w:rPr>
-      </w:pPr>
-      <w:r>
-        <w:rPr>
-          <w:rFonts w:ascii="Aptos Mono" w:hAnsi="Aptos Mono"/>
-        </w:rPr>
-        <w:t xml:space="preserve">        &lt;div class="glossary-item"&gt;</w:t>
-      </w:r>
-    </w:p>
-    <w:p>
-      <w:pPr>
-        <w:spacing w:after="0"/>
-        <w:rPr>
-          <w:rFonts w:ascii="Aptos Mono" w:hAnsi="Aptos Mono"/>
-        </w:rPr>
-      </w:pPr>
-      <w:r>
-        <w:rPr>
-          <w:rFonts w:ascii="Aptos Mono" w:hAnsi="Aptos Mono"/>
-        </w:rPr>
-        <w:t xml:space="preserve">            &lt;div class="glossary-term"&gt;Transfers&lt;/div&gt;</w:t>
-      </w:r>
-    </w:p>
-    <w:p>
-      <w:pPr>
-        <w:spacing w:after="0"/>
-        <w:rPr>
-          <w:rFonts w:ascii="Aptos Mono" w:hAnsi="Aptos Mono"/>
-        </w:rPr>
-      </w:pPr>
-      <w:r>
-        <w:rPr>
-          <w:rFonts w:ascii="Aptos Mono" w:hAnsi="Aptos Mono"/>
-        </w:rPr>
-        <w:t xml:space="preserve">            &lt;div class="glossary-def"&gt;</w:t>
-      </w:r>
-    </w:p>
-    <w:p>
-      <w:pPr>
-        <w:spacing w:after="0"/>
-        <w:rPr>
-          <w:rFonts w:ascii="Aptos Mono" w:hAnsi="Aptos Mono"/>
-        </w:rPr>
-      </w:pPr>
-      <w:r>
-        <w:rPr>
-          <w:rFonts w:ascii="Aptos Mono" w:hAnsi="Aptos Mono"/>
-        </w:rPr>
-        <w:t xml:space="preserve">                Inflows of future economic benefits/service potential from non-exchange transactions, OTHER than taxes.</w:t>
-      </w:r>
-    </w:p>
-    <w:p>
-      <w:pPr>
-        <w:spacing w:after="0"/>
-        <w:rPr>
-          <w:rFonts w:ascii="Aptos Mono" w:hAnsi="Aptos Mono"/>
-        </w:rPr>
-      </w:pPr>
-      <w:r>
-        <w:rPr>
-          <w:rFonts w:ascii="Aptos Mono" w:hAnsi="Aptos Mono"/>
-        </w:rPr>
-        <w:t xml:space="preserve">            &lt;/div&gt;</w:t>
-      </w:r>
-    </w:p>
-    <w:p>
-      <w:pPr>
-        <w:spacing w:after="0"/>
-        <w:rPr>
-          <w:rFonts w:ascii="Aptos Mono" w:hAnsi="Aptos Mono"/>
-        </w:rPr>
-      </w:pPr>
-      <w:r>
-        <w:rPr>
-          <w:rFonts w:ascii="Aptos Mono" w:hAnsi="Aptos Mono"/>
-        </w:rPr>
-        <w:t xml:space="preserve">        &lt;/div&gt;</w:t>
-      </w:r>
-    </w:p>
-    <w:p>
-      <w:pPr>
-        <w:spacing w:after="0"/>
-        <w:rPr>
-          <w:rFonts w:ascii="Aptos Mono" w:hAnsi="Aptos Mono"/>
-        </w:rPr>
-      </w:pPr>
-      <w:r>
-        <w:rPr>
-          <w:rFonts w:ascii="Aptos Mono" w:hAnsi="Aptos Mono"/>
-        </w:rPr>
-        <w:t xml:space="preserve">        &lt;div class="glossary-item"&gt;</w:t>
-      </w:r>
-    </w:p>
-    <w:p>
-      <w:pPr>
-        <w:spacing w:after="0"/>
-        <w:rPr>
-          <w:rFonts w:ascii="Aptos Mono" w:hAnsi="Aptos Mono"/>
-        </w:rPr>
-      </w:pPr>
-      <w:r>
-        <w:rPr>
-          <w:rFonts w:ascii="Aptos Mono" w:hAnsi="Aptos Mono"/>
-        </w:rPr>
-        <w:t xml:space="preserve">            &lt;div class="glossary-term"&gt;Control of an asset&lt;/div&gt;</w:t>
-      </w:r>
-    </w:p>
-    <w:p>
-      <w:pPr>
-        <w:spacing w:after="0"/>
-        <w:rPr>
-          <w:rFonts w:ascii="Aptos Mono" w:hAnsi="Aptos Mono"/>
-        </w:rPr>
-      </w:pPr>
-      <w:r>
-        <w:rPr>
-          <w:rFonts w:ascii="Aptos Mono" w:hAnsi="Aptos Mono"/>
-        </w:rPr>
-        <w:t xml:space="preserve">            &lt;div class="glossary-def"&gt;</w:t>
-      </w:r>
-    </w:p>
-    <w:p>
-      <w:pPr>
-        <w:spacing w:after="0"/>
-        <w:rPr>
-          <w:rFonts w:ascii="Aptos Mono" w:hAnsi="Aptos Mono"/>
-        </w:rPr>
-      </w:pPr>
-      <w:r>
-        <w:rPr>
-          <w:rFonts w:ascii="Aptos Mono" w:hAnsi="Aptos Mono"/>
-        </w:rPr>
-        <w:t xml:space="preserve">                Arises when the entity can use/benefit from the asset in pursuit of its objectives, AND can exclude or</w:t>
-      </w:r>
-    </w:p>
-    <w:p>
-      <w:pPr>
-        <w:spacing w:after="0"/>
-        <w:rPr>
-          <w:rFonts w:ascii="Aptos Mono" w:hAnsi="Aptos Mono"/>
-        </w:rPr>
-      </w:pPr>
-      <w:r>
-        <w:rPr>
-          <w:rFonts w:ascii="Aptos Mono" w:hAnsi="Aptos Mono"/>
-        </w:rPr>
-        <w:t xml:space="preserve">                regulate others' access to that benefit.</w:t>
-      </w:r>
-    </w:p>
-    <w:p>
-      <w:pPr>
-        <w:spacing w:after="0"/>
-        <w:rPr>
-          <w:rFonts w:ascii="Aptos Mono" w:hAnsi="Aptos Mono"/>
-        </w:rPr>
-      </w:pPr>
-      <w:r>
-        <w:rPr>
-          <w:rFonts w:ascii="Aptos Mono" w:hAnsi="Aptos Mono"/>
-        </w:rPr>
-        <w:t xml:space="preserve">            &lt;/div&gt;</w:t>
-      </w:r>
-    </w:p>
-    <w:p>
-      <w:pPr>
-        <w:spacing w:after="0"/>
-        <w:rPr>
-          <w:rFonts w:ascii="Aptos Mono" w:hAnsi="Aptos Mono"/>
-        </w:rPr>
-      </w:pPr>
-      <w:r>
-        <w:rPr>
-          <w:rFonts w:ascii="Aptos Mono" w:hAnsi="Aptos Mono"/>
-        </w:rPr>
-        <w:t xml:space="preserve">        &lt;/div&gt;</w:t>
-      </w:r>
-    </w:p>
-    <w:p>
-      <w:pPr>
-        <w:spacing w:after="0"/>
-        <w:rPr>
-          <w:rFonts w:ascii="Aptos Mono" w:hAnsi="Aptos Mono"/>
-        </w:rPr>
-      </w:pPr>
-      <w:r>
-        <w:rPr>
-          <w:rFonts w:ascii="Aptos Mono" w:hAnsi="Aptos Mono"/>
-        </w:rPr>
-        <w:t xml:space="preserve">        &lt;div class="glossary-item" style="border-bottom: none"&gt;</w:t>
-      </w:r>
-    </w:p>
-    <w:p>
-      <w:pPr>
-        <w:spacing w:after="0"/>
-        <w:rPr>
-          <w:rFonts w:ascii="Aptos Mono" w:hAnsi="Aptos Mono"/>
-        </w:rPr>
-      </w:pPr>
-      <w:r>
-        <w:rPr>
-          <w:rFonts w:ascii="Aptos Mono" w:hAnsi="Aptos Mono"/>
-        </w:rPr>
-        <w:t xml:space="preserve">            &lt;div class="glossary-term"&gt;The taxable event&lt;/div&gt;</w:t>
-      </w:r>
-    </w:p>
-    <w:p>
-      <w:pPr>
-        <w:spacing w:after="0"/>
-        <w:rPr>
-          <w:rFonts w:ascii="Aptos Mono" w:hAnsi="Aptos Mono"/>
-        </w:rPr>
-      </w:pPr>
-      <w:r>
-        <w:rPr>
-          <w:rFonts w:ascii="Aptos Mono" w:hAnsi="Aptos Mono"/>
-        </w:rPr>
-        <w:t xml:space="preserve">            &lt;div class="glossary-def"&gt;</w:t>
-      </w:r>
-    </w:p>
-    <w:p>
-      <w:pPr>
-        <w:spacing w:after="0"/>
-        <w:rPr>
-          <w:rFonts w:ascii="Aptos Mono" w:hAnsi="Aptos Mono"/>
-        </w:rPr>
-      </w:pPr>
-      <w:r>
-        <w:rPr>
-          <w:rFonts w:ascii="Aptos Mono" w:hAnsi="Aptos Mono"/>
-        </w:rPr>
-        <w:t xml:space="preserve">                The event that government/legislature/other authority has determined will be subject to taxation.</w:t>
-      </w:r>
-    </w:p>
-    <w:p>
-      <w:pPr>
-        <w:spacing w:after="0"/>
-        <w:rPr>
-          <w:rFonts w:ascii="Aptos Mono" w:hAnsi="Aptos Mono"/>
-        </w:rPr>
-      </w:pPr>
-      <w:r>
-        <w:rPr>
-          <w:rFonts w:ascii="Aptos Mono" w:hAnsi="Aptos Mono"/>
-        </w:rPr>
-        <w:lastRenderedPageBreak/>
-        <w:t xml:space="preserve">            &lt;/div&gt;</w:t>
-      </w:r>
-    </w:p>
-    <w:p>
-      <w:pPr>
-        <w:spacing w:after="0"/>
-        <w:rPr>
-          <w:rFonts w:ascii="Aptos Mono" w:hAnsi="Aptos Mono"/>
-        </w:rPr>
-      </w:pPr>
-      <w:r>
-        <w:rPr>
-          <w:rFonts w:ascii="Aptos Mono" w:hAnsi="Aptos Mono"/>
-        </w:rPr>
-        <w:t xml:space="preserve">        &lt;/div&gt;</w:t>
-      </w:r>
-    </w:p>
-    <w:p>
-      <w:pPr>
-        <w:spacing w:after="0"/>
-        <w:rPr>
-          <w:rFonts w:ascii="Aptos Mono" w:hAnsi="Aptos Mono"/>
-        </w:rPr>
-      </w:pPr>
-      <w:r>
-        <w:rPr>
-          <w:rFonts w:ascii="Aptos Mono" w:hAnsi="Aptos Mono"/>
-        </w:rPr>
-        <w:t xml:space="preserve">    &lt;/div&gt;</w:t>
-      </w:r>
-    </w:p>
-    <w:p>
-      <w:pPr>
-        <w:spacing w:after="0"/>
-        <w:rPr>
-          <w:rFonts w:ascii="Aptos Mono" w:hAnsi="Aptos Mono"/>
-          <w:b/>
-          <w:bCs/>
-        </w:rPr>
-      </w:pPr>
-      <w:r>
-        <w:rPr>
-          <w:rFonts w:ascii="Aptos Mono" w:hAnsi="Aptos Mono"/>
-          <w:b/>
-          <w:bCs/>
-        </w:rPr>
-        <w:t>CURRENT:</w:t>
-      </w:r>
-    </w:p>
-    <w:p>
-      <w:pPr>
-        <w:spacing w:after="0"/>
-        <w:rPr>
-          <w:rFonts w:ascii="Aptos Mono" w:hAnsi="Aptos Mono"/>
-        </w:rPr>
-      </w:pPr>
-    </w:p>
-    <w:p>
-      <w:pPr>
-        <w:spacing w:after="0"/>
-        <w:rPr>
-          <w:rFonts w:ascii="Aptos Mono" w:hAnsi="Aptos Mono"/>
-        </w:rPr>
-      </w:pPr>
-      <w:r>
-        <w:rPr>
-          <w:rFonts w:ascii="Aptos Mono" w:hAnsi="Aptos Mono"/>
-        </w:rPr>
-        <w:t>&lt;div class="card ci"&gt;</w:t>
-      </w:r>
-    </w:p>
-    <w:p>
-      <w:pPr>
-        <w:spacing w:after="0"/>
-        <w:rPr>
-          <w:rFonts w:ascii="Aptos Mono" w:hAnsi="Aptos Mono"/>
-        </w:rPr>
-      </w:pPr>
-      <w:r>
-        <w:rPr>
-          <w:rFonts w:ascii="Aptos Mono" w:hAnsi="Aptos Mono"/>
-        </w:rPr>
-        <w:t xml:space="preserve">    &lt;div class="</w:t>
-      </w:r>
-      <w:proofErr w:type="spellStart"/>
-      <w:r>
-        <w:rPr>
-          <w:rFonts w:ascii="Aptos Mono" w:hAnsi="Aptos Mono"/>
-        </w:rPr>
-        <w:t>ctitle</w:t>
-      </w:r>
-      <w:proofErr w:type="spellEnd"/>
-      <w:r>
-        <w:rPr>
-          <w:rFonts w:ascii="Aptos Mono" w:hAnsi="Aptos Mono"/>
-        </w:rPr>
-        <w:t xml:space="preserve"> cd"&gt;Objective &amp;amp; scope&lt;/div&gt;</w:t>
-      </w:r>
-    </w:p>
-    <w:p>
-      <w:pPr>
-        <w:spacing w:after="0"/>
-        <w:rPr>
-          <w:rFonts w:ascii="Aptos Mono" w:hAnsi="Aptos Mono"/>
-        </w:rPr>
-      </w:pPr>
-      <w:r>
-        <w:rPr>
-          <w:rFonts w:ascii="Aptos Mono" w:hAnsi="Aptos Mono"/>
-        </w:rPr>
-        <w:t xml:space="preserve">    &lt;div class="principle"&gt;</w:t>
-      </w:r>
-    </w:p>
-    <w:p>
-      <w:pPr>
-        <w:spacing w:after="0"/>
-        <w:rPr>
-          <w:rFonts w:ascii="Aptos Mono" w:hAnsi="Aptos Mono"/>
-        </w:rPr>
-      </w:pPr>
-      <w:r>
-        <w:rPr>
-          <w:rFonts w:ascii="Aptos Mono" w:hAnsi="Aptos Mono"/>
-        </w:rPr>
-        <w:t xml:space="preserve">        Establishes the principles for carrying cash-generating assets (and CGUs) at no more than their recoverable</w:t>
-      </w:r>
-    </w:p>
-    <w:p>
-      <w:pPr>
-        <w:spacing w:after="0"/>
-        <w:rPr>
-          <w:rFonts w:ascii="Aptos Mono" w:hAnsi="Aptos Mono"/>
-        </w:rPr>
-      </w:pPr>
-      <w:r>
-        <w:rPr>
-          <w:rFonts w:ascii="Aptos Mono" w:hAnsi="Aptos Mono"/>
-        </w:rPr>
-        <w:t xml:space="preserve">        amount — the higher of fair value less costs to sell and value in use. Applies to all assets (except those held</w:t>
-      </w:r>
-    </w:p>
-    <w:p>
-      <w:pPr>
-        <w:spacing w:after="0"/>
-        <w:rPr>
-          <w:rFonts w:ascii="Aptos Mono" w:hAnsi="Aptos Mono"/>
-        </w:rPr>
-      </w:pPr>
-      <w:r>
-        <w:rPr>
-          <w:rFonts w:ascii="Aptos Mono" w:hAnsi="Aptos Mono"/>
-        </w:rPr>
-        <w:t xml:space="preserve">        for sale) that may be impaired at the reporting date.</w:t>
-      </w:r>
-    </w:p>
-    <w:p>
-      <w:pPr>
-        <w:spacing w:after="0"/>
-        <w:rPr>
-          <w:rFonts w:ascii="Aptos Mono" w:hAnsi="Aptos Mono"/>
-        </w:rPr>
-      </w:pPr>
-      <w:r>
-        <w:rPr>
-          <w:rFonts w:ascii="Aptos Mono" w:hAnsi="Aptos Mono"/>
-        </w:rPr>
-        <w:t xml:space="preserve">    &lt;/div&gt;</w:t>
-      </w:r>
-    </w:p>
-    <w:p>
-      <w:pPr>
-        <w:spacing w:after="0"/>
-        <w:rPr>
-          <w:rFonts w:ascii="Aptos Mono" w:hAnsi="Aptos Mono"/>
-        </w:rPr>
-      </w:pPr>
-      <w:r>
-        <w:rPr>
-          <w:rFonts w:ascii="Aptos Mono" w:hAnsi="Aptos Mono"/>
-        </w:rPr>
-        <w:t xml:space="preserve">    &lt;div class="glossary-item"&gt;</w:t>
-      </w:r>
-    </w:p>
-    <w:p>
-      <w:pPr>
-        <w:spacing w:after="0"/>
-        <w:rPr>
-          <w:rFonts w:ascii="Aptos Mono" w:hAnsi="Aptos Mono"/>
-        </w:rPr>
-      </w:pPr>
-      <w:r>
-        <w:rPr>
-          <w:rFonts w:ascii="Aptos Mono" w:hAnsi="Aptos Mono"/>
-        </w:rPr>
-        <w:t xml:space="preserve">        &lt;div class="glossary-term"&gt;Cash-generating asset&lt;/div&gt;</w:t>
-      </w:r>
-    </w:p>
-    <w:p>
-      <w:pPr>
-        <w:spacing w:after="0"/>
-        <w:rPr>
-          <w:rFonts w:ascii="Aptos Mono" w:hAnsi="Aptos Mono"/>
-        </w:rPr>
-      </w:pPr>
-      <w:r>
-        <w:rPr>
-          <w:rFonts w:ascii="Aptos Mono" w:hAnsi="Aptos Mono"/>
-        </w:rPr>
-        <w:t xml:space="preserve">        &lt;div class="glossary-def"&gt;</w:t>
-      </w:r>
-    </w:p>
-    <w:p>
-      <w:pPr>
-        <w:spacing w:after="0"/>
-        <w:rPr>
-          <w:rFonts w:ascii="Aptos Mono" w:hAnsi="Aptos Mono"/>
-        </w:rPr>
-      </w:pPr>
-      <w:r>
-        <w:rPr>
-          <w:rFonts w:ascii="Aptos Mono" w:hAnsi="Aptos Mono"/>
-        </w:rPr>
-        <w:t xml:space="preserve">            An asset (or group of assets) that generates an indivisible group of cash flows that are largely independent</w:t>
-      </w:r>
-    </w:p>
-    <w:p>
-      <w:pPr>
-        <w:spacing w:after="0"/>
-        <w:rPr>
-          <w:rFonts w:ascii="Aptos Mono" w:hAnsi="Aptos Mono"/>
-        </w:rPr>
-      </w:pPr>
-      <w:r>
-        <w:rPr>
-          <w:rFonts w:ascii="Aptos Mono" w:hAnsi="Aptos Mono"/>
-        </w:rPr>
-        <w:t xml:space="preserve">            of the cash flows from other assets.</w:t>
-      </w:r>
-    </w:p>
-    <w:p>
-      <w:pPr>
-        <w:spacing w:after="0"/>
-        <w:rPr>
-          <w:rFonts w:ascii="Aptos Mono" w:hAnsi="Aptos Mono"/>
-        </w:rPr>
-      </w:pPr>
-      <w:r>
-        <w:rPr>
-          <w:rFonts w:ascii="Aptos Mono" w:hAnsi="Aptos Mono"/>
-        </w:rPr>
-        <w:t xml:space="preserve">        &lt;/div&gt;</w:t>
-      </w:r>
-    </w:p>
-    <w:p>
-      <w:pPr>
-        <w:spacing w:after="0"/>
-        <w:rPr>
-          <w:rFonts w:ascii="Aptos Mono" w:hAnsi="Aptos Mono"/>
-        </w:rPr>
-      </w:pPr>
-      <w:r>
-        <w:rPr>
-          <w:rFonts w:ascii="Aptos Mono" w:hAnsi="Aptos Mono"/>
-        </w:rPr>
-        <w:t xml:space="preserve">    &lt;/div&gt;</w:t>
-      </w:r>
-    </w:p>
-    <w:p>
-      <w:pPr>
-        <w:spacing w:after="0"/>
-        <w:rPr>
-          <w:rFonts w:ascii="Aptos Mono" w:hAnsi="Aptos Mono"/>
-        </w:rPr>
-      </w:pPr>
-      <w:r>
-        <w:rPr>
-          <w:rFonts w:ascii="Aptos Mono" w:hAnsi="Aptos Mono"/>
-        </w:rPr>
-        <w:t xml:space="preserve">    &lt;div class="glossary-item" style="border-bottom: none"&gt;</w:t>
-      </w:r>
-    </w:p>
-    <w:p>
-      <w:pPr>
-        <w:spacing w:after="0"/>
-        <w:rPr>
-          <w:rFonts w:ascii="Aptos Mono" w:hAnsi="Aptos Mono"/>
-        </w:rPr>
-      </w:pPr>
-      <w:r>
-        <w:rPr>
-          <w:rFonts w:ascii="Aptos Mono" w:hAnsi="Aptos Mono"/>
-        </w:rPr>
-        <w:t xml:space="preserve">        &lt;div class="glossary-term"&gt;Recoverable amount&lt;/div&gt;</w:t>
-      </w:r>
-    </w:p>
-    <w:p>
-      <w:pPr>
-        <w:spacing w:after="0"/>
-        <w:rPr>
-          <w:rFonts w:ascii="Aptos Mono" w:hAnsi="Aptos Mono"/>
-        </w:rPr>
-      </w:pPr>
-      <w:r>
-        <w:rPr>
-          <w:rFonts w:ascii="Aptos Mono" w:hAnsi="Aptos Mono"/>
-        </w:rPr>
-        <w:t xml:space="preserve">        &lt;div class="glossary-def"&gt;The higher of an asset's fair value less costs to sell and its value in </w:t>
-      </w:r>
-      <w:proofErr w:type="gramStart"/>
-      <w:r>
-        <w:rPr>
-          <w:rFonts w:ascii="Aptos Mono" w:hAnsi="Aptos Mono"/>
-        </w:rPr>
-        <w:t>use.&lt;</w:t>
-      </w:r>
-      <w:proofErr w:type="gramEnd"/>
-      <w:r>
-        <w:rPr>
-          <w:rFonts w:ascii="Aptos Mono" w:hAnsi="Aptos Mono"/>
-        </w:rPr>
-        <w:t>/div&gt;</w:t>
-      </w:r>
-    </w:p>
-    <w:p>
-      <w:pPr>
-        <w:spacing w:after="0"/>
-        <w:rPr>
-          <w:rFonts w:ascii="Aptos Mono" w:hAnsi="Aptos Mono"/>
-        </w:rPr>
-      </w:pPr>
-      <w:r>
-        <w:rPr>
-          <w:rFonts w:ascii="Aptos Mono" w:hAnsi="Aptos Mono"/>
-        </w:rPr>
-        <w:t xml:space="preserve">    &lt;/div&gt;</w:t>
-      </w:r>
-    </w:p>
-    <w:p>
-      <w:pPr>
-        <w:spacing w:after="0"/>
-        <w:rPr>
-          <w:rFonts w:ascii="Aptos Mono" w:hAnsi="Aptos Mono"/>
-        </w:rPr>
-      </w:pPr>
-      <w:r>
-        <w:rPr>
-          <w:rFonts w:ascii="Aptos Mono" w:hAnsi="Aptos Mono"/>
-        </w:rPr>
-        <w:t>&lt;/div&gt;</w:t>
-      </w:r>
-    </w:p>
-    <w:p>
-      <w:pPr>
-        <w:spacing w:after="0"/>
-        <w:rPr>
-          <w:rFonts w:ascii="Aptos Mono" w:hAnsi="Aptos Mono"/>
-        </w:rPr>
-      </w:pPr>
-    </w:p>
-    <w:p>
-      <w:pPr>
-        <w:spacing w:after="0"/>
-        <w:rPr>
-          <w:rFonts w:ascii="Aptos Mono" w:hAnsi="Aptos Mono"/>
-        </w:rPr>
-      </w:pPr>
-      <w:r>
-        <w:rPr>
-          <w:rFonts w:ascii="Aptos Mono" w:hAnsi="Aptos Mono"/>
-        </w:rPr>
-        <w:t>+------------------+-----------------+</w:t>
-      </w:r>
-    </w:p>
-    <w:p>
-      <w:pPr>
-        <w:spacing w:after="0"/>
-        <w:rPr>
-          <w:rFonts w:ascii="Aptos Mono" w:hAnsi="Aptos Mono"/>
-        </w:rPr>
-      </w:pPr>
-      <w:r>
-        <w:rPr>
-          <w:rFonts w:ascii="Aptos Mono" w:hAnsi="Aptos Mono"/>
-        </w:rPr>
-        <w:t>| Objective &amp; scope| Key definitions |</w:t>
-      </w:r>
-    </w:p>
-    <w:p>
-      <w:pPr>
-        <w:spacing w:after="0"/>
-        <w:rPr>
-          <w:rFonts w:ascii="Aptos Mono" w:hAnsi="Aptos Mono"/>
-        </w:rPr>
-      </w:pPr>
-      <w:r>
-        <w:rPr>
-          <w:rFonts w:ascii="Aptos Mono" w:hAnsi="Aptos Mono"/>
-        </w:rPr>
-        <w:t>+------------------+-----------------+</w:t>
-      </w:r>
-    </w:p>
-    <w:p>
-      <w:pPr>
-        <w:spacing w:after="0"/>
-        <w:rPr>
-          <w:rFonts w:ascii="Aptos Mono" w:hAnsi="Aptos Mono"/>
-        </w:rPr>
-      </w:pPr>
-      <w:r>
-        <w:rPr>
-          <w:rFonts w:ascii="Aptos Mono" w:hAnsi="Aptos Mono"/>
-        </w:rPr>
-        <w:t xml:space="preserve">| </w:t>
-      </w:r>
-      <w:r>
-        <w:rPr>
-          <w:rFonts w:ascii="Aptos Mono" w:hAnsi="Aptos Mono"/>
-        </w:rPr>
-        <w:t xml:space="preserve">         </w:t>
-      </w:r>
-      <w:r>
-        <w:rPr>
-          <w:rFonts w:ascii="Aptos Mono" w:hAnsi="Aptos Mono"/>
-        </w:rPr>
-        <w:t xml:space="preserve">Scope exclusions </w:t>
-      </w:r>
-      <w:r>
-        <w:rPr>
-          <w:rFonts w:ascii="Aptos Mono" w:hAnsi="Aptos Mono"/>
-        </w:rPr>
-        <w:t xml:space="preserve">   </w:t>
-      </w:r>
-      <w:r>
-        <w:rPr>
-          <w:rFonts w:ascii="Aptos Mono" w:hAnsi="Aptos Mono"/>
-        </w:rPr>
-        <w:t xml:space="preserve">      |</w:t>
-      </w:r>
-    </w:p>
-    <w:p>
-      <w:pPr>
-        <w:spacing w:after="0"/>
-        <w:rPr>
-          <w:rFonts w:ascii="Aptos Mono" w:hAnsi="Aptos Mono"/>
-        </w:rPr>
-      </w:pPr>
-      <w:r>
-        <w:rPr>
-          <w:rFonts w:ascii="Aptos Mono" w:hAnsi="Aptos Mono"/>
-        </w:rPr>
-        <w:t>+------------------+-----------------+</w:t>
-      </w:r>
-    </w:p>
-    <w:p>
-      <w:pPr>
-        <w:spacing w:after="0"/>
-        <w:rPr>
-          <w:rFonts w:ascii="Aptos Mono" w:hAnsi="Aptos Mono"/>
-        </w:rPr>
-      </w:pPr>
-    </w:p>
-    <w:p>
-      <w:pPr>
-        <w:spacing w:after="0"/>
-        <w:rPr>
-          <w:rFonts w:ascii="Aptos Mono" w:hAnsi="Aptos Mono"/>
-        </w:rPr>
-      </w:pPr>
-      <w:r>
-        <w:rPr>
-          <w:rFonts w:ascii="Aptos Mono" w:hAnsi="Aptos Mono"/>
-        </w:rPr>
-        <w:t>+-------------------+</w:t>
-      </w:r>
-    </w:p>
-    <w:p>
-      <w:pPr>
-        <w:spacing w:after="0"/>
-        <w:rPr>
-          <w:rFonts w:ascii="Aptos Mono" w:hAnsi="Aptos Mono"/>
-        </w:rPr>
-      </w:pPr>
-      <w:r>
-        <w:rPr>
-          <w:rFonts w:ascii="Aptos Mono" w:hAnsi="Aptos Mono"/>
-        </w:rPr>
-        <w:t>| Objective &amp; scope |</w:t>
-      </w:r>
-    </w:p>
-    <w:p>
-      <w:pPr>
-        <w:spacing w:after="0"/>
-        <w:rPr>
-          <w:rFonts w:ascii="Aptos Mono" w:hAnsi="Aptos Mono"/>
-        </w:rPr>
-      </w:pPr>
-      <w:r>
-        <w:rPr>
-          <w:rFonts w:ascii="Aptos Mono" w:hAnsi="Aptos Mono"/>
-        </w:rPr>
-        <w:t>+-------------------+</w:t>
-      </w:r>
-    </w:p>
-    <w:p>
-      <w:pPr>
-        <w:spacing w:after="0"/>
-        <w:rPr>
-          <w:rFonts w:ascii="Aptos Mono" w:hAnsi="Aptos Mono"/>
-        </w:rPr>
-      </w:pPr>
-      <w:r>
-        <w:rPr>
-          <w:rFonts w:ascii="Aptos Mono" w:hAnsi="Aptos Mono"/>
-        </w:rPr>
-        <w:t>| Key definitions   |</w:t>
-      </w:r>
-    </w:p>
-    <w:p>
-      <w:pPr>
-        <w:spacing w:after="0"/>
-        <w:rPr>
-          <w:rFonts w:ascii="Aptos Mono" w:hAnsi="Aptos Mono"/>
-        </w:rPr>
-      </w:pPr>
-      <w:r>
-        <w:rPr>
-          <w:rFonts w:ascii="Aptos Mono" w:hAnsi="Aptos Mono"/>
-        </w:rPr>
-        <w:t>+-------------------+</w:t>
-      </w:r>
-    </w:p>
-    <w:p>
-      <w:pPr>
-        <w:spacing w:after="0"/>
-        <w:rPr>
-          <w:rFonts w:ascii="Aptos Mono" w:hAnsi="Aptos Mono"/>
-        </w:rPr>
-      </w:pPr>
-      <w:r>
-        <w:rPr>
-          <w:rFonts w:ascii="Aptos Mono" w:hAnsi="Aptos Mono"/>
-        </w:rPr>
-        <w:t xml:space="preserve">| Scope </w:t>
-      </w:r>
-      <w:proofErr w:type="gramStart"/>
-      <w:r>
-        <w:rPr>
-          <w:rFonts w:ascii="Aptos Mono" w:hAnsi="Aptos Mono"/>
-        </w:rPr>
-        <w:t>exclusions  |</w:t>
-      </w:r>
-      <w:proofErr w:type="gramEnd"/>
-    </w:p>
-    <w:p>
-      <w:pPr>
-        <w:spacing w:after="0"/>
-        <w:rPr>
-          <w:rFonts w:ascii="Aptos Mono" w:hAnsi="Aptos Mono"/>
-        </w:rPr>
-      </w:pPr>
-      <w:r>
-        <w:rPr>
-          <w:rFonts w:ascii="Aptos Mono" w:hAnsi="Aptos Mono"/>
-        </w:rPr>
-        <w:t>+-------------------+</w:t>
-      </w:r>
     </w:p>
     <w:sectPr>
       <w:pgSz w:w="11906" w:h="16838"/>
@@ -6832,6 +7113,155 @@
     </w:lvl>
   </w:abstractNum>
   <w:abstractNum w:abstractNumId="5" w15:restartNumberingAfterBreak="0">
+    <w:nsid w:val="1DA20785"/>
+    <w:multiLevelType w:val="multilevel"/>
+    <w:tmpl w:val="5D84F000"/>
+    <w:lvl w:ilvl="0">
+      <w:start w:val="1"/>
+      <w:numFmt w:val="bullet"/>
+      <w:lvlText w:val=""/>
+      <w:lvlJc w:val="left"/>
+      <w:pPr>
+        <w:tabs>
+          <w:tab w:val="num" w:pos="720"/>
+        </w:tabs>
+        <w:ind w:left="720" w:hanging="360"/>
+      </w:pPr>
+      <w:rPr>
+        <w:rFonts w:ascii="Symbol" w:hAnsi="Symbol" w:hint="default"/>
+        <w:sz w:val="20"/>
+      </w:rPr>
+    </w:lvl>
+    <w:lvl w:ilvl="1" w:tentative="1">
+      <w:start w:val="1"/>
+      <w:numFmt w:val="bullet"/>
+      <w:lvlText w:val="o"/>
+      <w:lvlJc w:val="left"/>
+      <w:pPr>
+        <w:tabs>
+          <w:tab w:val="num" w:pos="1440"/>
+        </w:tabs>
+        <w:ind w:left="1440" w:hanging="360"/>
+      </w:pPr>
+      <w:rPr>
+        <w:rFonts w:ascii="Courier New" w:hAnsi="Courier New" w:hint="default"/>
+        <w:sz w:val="20"/>
+      </w:rPr>
+    </w:lvl>
+    <w:lvl w:ilvl="2" w:tentative="1">
+      <w:start w:val="1"/>
+      <w:numFmt w:val="bullet"/>
+      <w:lvlText w:val=""/>
+      <w:lvlJc w:val="left"/>
+      <w:pPr>
+        <w:tabs>
+          <w:tab w:val="num" w:pos="2160"/>
+        </w:tabs>
+        <w:ind w:left="2160" w:hanging="360"/>
+      </w:pPr>
+      <w:rPr>
+        <w:rFonts w:ascii="Wingdings" w:hAnsi="Wingdings" w:hint="default"/>
+        <w:sz w:val="20"/>
+      </w:rPr>
+    </w:lvl>
+    <w:lvl w:ilvl="3" w:tentative="1">
+      <w:start w:val="1"/>
+      <w:numFmt w:val="bullet"/>
+      <w:lvlText w:val=""/>
+      <w:lvlJc w:val="left"/>
+      <w:pPr>
+        <w:tabs>
+          <w:tab w:val="num" w:pos="2880"/>
+        </w:tabs>
+        <w:ind w:left="2880" w:hanging="360"/>
+      </w:pPr>
+      <w:rPr>
+        <w:rFonts w:ascii="Wingdings" w:hAnsi="Wingdings" w:hint="default"/>
+        <w:sz w:val="20"/>
+      </w:rPr>
+    </w:lvl>
+    <w:lvl w:ilvl="4" w:tentative="1">
+      <w:start w:val="1"/>
+      <w:numFmt w:val="bullet"/>
+      <w:lvlText w:val=""/>
+      <w:lvlJc w:val="left"/>
+      <w:pPr>
+        <w:tabs>
+          <w:tab w:val="num" w:pos="3600"/>
+        </w:tabs>
+        <w:ind w:left="3600" w:hanging="360"/>
+      </w:pPr>
+      <w:rPr>
+        <w:rFonts w:ascii="Wingdings" w:hAnsi="Wingdings" w:hint="default"/>
+        <w:sz w:val="20"/>
+      </w:rPr>
+    </w:lvl>
+    <w:lvl w:ilvl="5" w:tentative="1">
+      <w:start w:val="1"/>
+      <w:numFmt w:val="bullet"/>
+      <w:lvlText w:val=""/>
+      <w:lvlJc w:val="left"/>
+      <w:pPr>
+        <w:tabs>
+          <w:tab w:val="num" w:pos="4320"/>
+        </w:tabs>
+        <w:ind w:left="4320" w:hanging="360"/>
+      </w:pPr>
+      <w:rPr>
+        <w:rFonts w:ascii="Wingdings" w:hAnsi="Wingdings" w:hint="default"/>
+        <w:sz w:val="20"/>
+      </w:rPr>
+    </w:lvl>
+    <w:lvl w:ilvl="6" w:tentative="1">
+      <w:start w:val="1"/>
+      <w:numFmt w:val="bullet"/>
+      <w:lvlText w:val=""/>
+      <w:lvlJc w:val="left"/>
+      <w:pPr>
+        <w:tabs>
+          <w:tab w:val="num" w:pos="5040"/>
+        </w:tabs>
+        <w:ind w:left="5040" w:hanging="360"/>
+      </w:pPr>
+      <w:rPr>
+        <w:rFonts w:ascii="Wingdings" w:hAnsi="Wingdings" w:hint="default"/>
+        <w:sz w:val="20"/>
+      </w:rPr>
+    </w:lvl>
+    <w:lvl w:ilvl="7" w:tentative="1">
+      <w:start w:val="1"/>
+      <w:numFmt w:val="bullet"/>
+      <w:lvlText w:val=""/>
+      <w:lvlJc w:val="left"/>
+      <w:pPr>
+        <w:tabs>
+          <w:tab w:val="num" w:pos="5760"/>
+        </w:tabs>
+        <w:ind w:left="5760" w:hanging="360"/>
+      </w:pPr>
+      <w:rPr>
+        <w:rFonts w:ascii="Wingdings" w:hAnsi="Wingdings" w:hint="default"/>
+        <w:sz w:val="20"/>
+      </w:rPr>
+    </w:lvl>
+    <w:lvl w:ilvl="8" w:tentative="1">
+      <w:start w:val="1"/>
+      <w:numFmt w:val="bullet"/>
+      <w:lvlText w:val=""/>
+      <w:lvlJc w:val="left"/>
+      <w:pPr>
+        <w:tabs>
+          <w:tab w:val="num" w:pos="6480"/>
+        </w:tabs>
+        <w:ind w:left="6480" w:hanging="360"/>
+      </w:pPr>
+      <w:rPr>
+        <w:rFonts w:ascii="Wingdings" w:hAnsi="Wingdings" w:hint="default"/>
+        <w:sz w:val="20"/>
+      </w:rPr>
+    </w:lvl>
+  </w:abstractNum>
+  <w:abstractNum w:abstractNumId="6" w15:restartNumberingAfterBreak="0">
     <w:nsid w:val="201B6CC2"/>
     <w:multiLevelType w:val="multilevel"/>
     <w:tmpl w:val="277881B2"/>
@@ -6980,7 +7410,7 @@
       </w:rPr>
     </w:lvl>
   </w:abstractNum>
-  <w:abstractNum w:abstractNumId="6" w15:restartNumberingAfterBreak="0">
+  <w:abstractNum w:abstractNumId="7" w15:restartNumberingAfterBreak="0">
     <w:nsid w:val="23BB685C"/>
     <w:multiLevelType w:val="multilevel"/>
     <w:tmpl w:val="A442FE56"/>
@@ -7129,7 +7559,124 @@
       </w:rPr>
     </w:lvl>
   </w:abstractNum>
-  <w:abstractNum w:abstractNumId="7" w15:restartNumberingAfterBreak="0">
+  <w:abstractNum w:abstractNumId="8" w15:restartNumberingAfterBreak="0">
+    <w:nsid w:val="27BE5C23"/>
+    <w:multiLevelType w:val="multilevel"/>
+    <w:tmpl w:val="E22EC54C"/>
+    <w:lvl w:ilvl="0">
+      <w:start w:val="1"/>
+      <w:numFmt w:val="decimal"/>
+      <w:lvlText w:val="%1."/>
+      <w:lvlJc w:val="left"/>
+      <w:pPr>
+        <w:tabs>
+          <w:tab w:val="num" w:pos="720"/>
+        </w:tabs>
+        <w:ind w:left="720" w:hanging="360"/>
+      </w:pPr>
+    </w:lvl>
+    <w:lvl w:ilvl="1">
+      <w:start w:val="1"/>
+      <w:numFmt w:val="bullet"/>
+      <w:lvlText w:val="o"/>
+      <w:lvlJc w:val="left"/>
+      <w:pPr>
+        <w:tabs>
+          <w:tab w:val="num" w:pos="1440"/>
+        </w:tabs>
+        <w:ind w:left="1440" w:hanging="360"/>
+      </w:pPr>
+      <w:rPr>
+        <w:rFonts w:ascii="Courier New" w:hAnsi="Courier New" w:hint="default"/>
+        <w:sz w:val="20"/>
+      </w:rPr>
+    </w:lvl>
+    <w:lvl w:ilvl="2" w:tentative="1">
+      <w:start w:val="1"/>
+      <w:numFmt w:val="decimal"/>
+      <w:lvlText w:val="%3."/>
+      <w:lvlJc w:val="left"/>
+      <w:pPr>
+        <w:tabs>
+          <w:tab w:val="num" w:pos="2160"/>
+        </w:tabs>
+        <w:ind w:left="2160" w:hanging="360"/>
+      </w:pPr>
+    </w:lvl>
+    <w:lvl w:ilvl="3" w:tentative="1">
+      <w:start w:val="1"/>
+      <w:numFmt w:val="decimal"/>
+      <w:lvlText w:val="%4."/>
+      <w:lvlJc w:val="left"/>
+      <w:pPr>
+        <w:tabs>
+          <w:tab w:val="num" w:pos="2880"/>
+        </w:tabs>
+        <w:ind w:left="2880" w:hanging="360"/>
+      </w:pPr>
+    </w:lvl>
+    <w:lvl w:ilvl="4" w:tentative="1">
+      <w:start w:val="1"/>
+      <w:numFmt w:val="decimal"/>
+      <w:lvlText w:val="%5."/>
+      <w:lvlJc w:val="left"/>
+      <w:pPr>
+        <w:tabs>
+          <w:tab w:val="num" w:pos="3600"/>
+        </w:tabs>
+        <w:ind w:left="3600" w:hanging="360"/>
+      </w:pPr>
+    </w:lvl>
+    <w:lvl w:ilvl="5" w:tentative="1">
+      <w:start w:val="1"/>
+      <w:numFmt w:val="decimal"/>
+      <w:lvlText w:val="%6."/>
+      <w:lvlJc w:val="left"/>
+      <w:pPr>
+        <w:tabs>
+          <w:tab w:val="num" w:pos="4320"/>
+        </w:tabs>
+        <w:ind w:left="4320" w:hanging="360"/>
+      </w:pPr>
+    </w:lvl>
+    <w:lvl w:ilvl="6" w:tentative="1">
+      <w:start w:val="1"/>
+      <w:numFmt w:val="decimal"/>
+      <w:lvlText w:val="%7."/>
+      <w:lvlJc w:val="left"/>
+      <w:pPr>
+        <w:tabs>
+          <w:tab w:val="num" w:pos="5040"/>
+        </w:tabs>
+        <w:ind w:left="5040" w:hanging="360"/>
+      </w:pPr>
+    </w:lvl>
+    <w:lvl w:ilvl="7" w:tentative="1">
+      <w:start w:val="1"/>
+      <w:numFmt w:val="decimal"/>
+      <w:lvlText w:val="%8."/>
+      <w:lvlJc w:val="left"/>
+      <w:pPr>
+        <w:tabs>
+          <w:tab w:val="num" w:pos="5760"/>
+        </w:tabs>
+        <w:ind w:left="5760" w:hanging="360"/>
+      </w:pPr>
+    </w:lvl>
+    <w:lvl w:ilvl="8" w:tentative="1">
+      <w:start w:val="1"/>
+      <w:numFmt w:val="decimal"/>
+      <w:lvlText w:val="%9."/>
+      <w:lvlJc w:val="left"/>
+      <w:pPr>
+        <w:tabs>
+          <w:tab w:val="num" w:pos="6480"/>
+        </w:tabs>
+        <w:ind w:left="6480" w:hanging="360"/>
+      </w:pPr>
+    </w:lvl>
+  </w:abstractNum>
+  <w:abstractNum w:abstractNumId="9" w15:restartNumberingAfterBreak="0">
     <w:nsid w:val="2F300778"/>
     <w:multiLevelType w:val="multilevel"/>
     <w:tmpl w:val="92DA1C16"/>
@@ -7278,7 +7825,120 @@
       </w:rPr>
     </w:lvl>
   </w:abstractNum>
-  <w:abstractNum w:abstractNumId="8" w15:restartNumberingAfterBreak="0">
+  <w:abstractNum w:abstractNumId="10" w15:restartNumberingAfterBreak="0">
+    <w:nsid w:val="3C485B63"/>
+    <w:multiLevelType w:val="multilevel"/>
+    <w:tmpl w:val="41A6E09C"/>
+    <w:lvl w:ilvl="0">
+      <w:start w:val="1"/>
+      <w:numFmt w:val="decimal"/>
+      <w:lvlText w:val="%1."/>
+      <w:lvlJc w:val="left"/>
+      <w:pPr>
+        <w:tabs>
+          <w:tab w:val="num" w:pos="720"/>
+        </w:tabs>
+        <w:ind w:left="720" w:hanging="360"/>
+      </w:pPr>
+    </w:lvl>
+    <w:lvl w:ilvl="1" w:tentative="1">
+      <w:start w:val="1"/>
+      <w:numFmt w:val="decimal"/>
+      <w:lvlText w:val="%2."/>
+      <w:lvlJc w:val="left"/>
+      <w:pPr>
+        <w:tabs>
+          <w:tab w:val="num" w:pos="1440"/>
+        </w:tabs>
+        <w:ind w:left="1440" w:hanging="360"/>
+      </w:pPr>
+    </w:lvl>
+    <w:lvl w:ilvl="2" w:tentative="1">
+      <w:start w:val="1"/>
+      <w:numFmt w:val="decimal"/>
+      <w:lvlText w:val="%3."/>
+      <w:lvlJc w:val="left"/>
+      <w:pPr>
+        <w:tabs>
+          <w:tab w:val="num" w:pos="2160"/>
+        </w:tabs>
+        <w:ind w:left="2160" w:hanging="360"/>
+      </w:pPr>
+    </w:lvl>
+    <w:lvl w:ilvl="3" w:tentative="1">
+      <w:start w:val="1"/>
+      <w:numFmt w:val="decimal"/>
+      <w:lvlText w:val="%4."/>
+      <w:lvlJc w:val="left"/>
+      <w:pPr>
+        <w:tabs>
+          <w:tab w:val="num" w:pos="2880"/>
+        </w:tabs>
+        <w:ind w:left="2880" w:hanging="360"/>
+      </w:pPr>
+    </w:lvl>
+    <w:lvl w:ilvl="4" w:tentative="1">
+      <w:start w:val="1"/>
+      <w:numFmt w:val="decimal"/>
+      <w:lvlText w:val="%5."/>
+      <w:lvlJc w:val="left"/>
+      <w:pPr>
+        <w:tabs>
+          <w:tab w:val="num" w:pos="3600"/>
+        </w:tabs>
+        <w:ind w:left="3600" w:hanging="360"/>
+      </w:pPr>
+    </w:lvl>
+    <w:lvl w:ilvl="5" w:tentative="1">
+      <w:start w:val="1"/>
+      <w:numFmt w:val="decimal"/>
+      <w:lvlText w:val="%6."/>
+      <w:lvlJc w:val="left"/>
+      <w:pPr>
+        <w:tabs>
+          <w:tab w:val="num" w:pos="4320"/>
+        </w:tabs>
+        <w:ind w:left="4320" w:hanging="360"/>
+      </w:pPr>
+    </w:lvl>
+    <w:lvl w:ilvl="6" w:tentative="1">
+      <w:start w:val="1"/>
+      <w:numFmt w:val="decimal"/>
+      <w:lvlText w:val="%7."/>
+      <w:lvlJc w:val="left"/>
+      <w:pPr>
+        <w:tabs>
+          <w:tab w:val="num" w:pos="5040"/>
+        </w:tabs>
+        <w:ind w:left="5040" w:hanging="360"/>
+      </w:pPr>
+    </w:lvl>
+    <w:lvl w:ilvl="7" w:tentative="1">
+      <w:start w:val="1"/>
+      <w:numFmt w:val="decimal"/>
+      <w:lvlText w:val="%8."/>
+      <w:lvlJc w:val="left"/>
+      <w:pPr>
+        <w:tabs>
+          <w:tab w:val="num" w:pos="5760"/>
+        </w:tabs>
+        <w:ind w:left="5760" w:hanging="360"/>
+      </w:pPr>
+    </w:lvl>
+    <w:lvl w:ilvl="8" w:tentative="1">
+      <w:start w:val="1"/>
+      <w:numFmt w:val="decimal"/>
+      <w:lvlText w:val="%9."/>
+      <w:lvlJc w:val="left"/>
+      <w:pPr>
+        <w:tabs>
+          <w:tab w:val="num" w:pos="6480"/>
+        </w:tabs>
+        <w:ind w:left="6480" w:hanging="360"/>
+      </w:pPr>
+    </w:lvl>
+  </w:abstractNum>
+  <w:abstractNum w:abstractNumId="11" w15:restartNumberingAfterBreak="0">
     <w:nsid w:val="427D64C0"/>
     <w:multiLevelType w:val="multilevel"/>
     <w:tmpl w:val="ECB465C4"/>
@@ -7427,7 +8087,7 @@
       </w:rPr>
     </w:lvl>
   </w:abstractNum>
-  <w:abstractNum w:abstractNumId="9" w15:restartNumberingAfterBreak="0">
+  <w:abstractNum w:abstractNumId="12" w15:restartNumberingAfterBreak="0">
     <w:nsid w:val="50B33B92"/>
     <w:multiLevelType w:val="multilevel"/>
     <w:tmpl w:val="2F3EA61E"/>
@@ -7576,7 +8236,156 @@
       </w:rPr>
     </w:lvl>
   </w:abstractNum>
-  <w:abstractNum w:abstractNumId="10" w15:restartNumberingAfterBreak="0">
+  <w:abstractNum w:abstractNumId="13" w15:restartNumberingAfterBreak="0">
+    <w:nsid w:val="53285E93"/>
+    <w:multiLevelType w:val="multilevel"/>
+    <w:tmpl w:val="F726F8E2"/>
+    <w:lvl w:ilvl="0">
+      <w:start w:val="1"/>
+      <w:numFmt w:val="bullet"/>
+      <w:lvlText w:val=""/>
+      <w:lvlJc w:val="left"/>
+      <w:pPr>
+        <w:tabs>
+          <w:tab w:val="num" w:pos="720"/>
+        </w:tabs>
+        <w:ind w:left="720" w:hanging="360"/>
+      </w:pPr>
+      <w:rPr>
+        <w:rFonts w:ascii="Symbol" w:hAnsi="Symbol" w:hint="default"/>
+        <w:sz w:val="20"/>
+      </w:rPr>
+    </w:lvl>
+    <w:lvl w:ilvl="1" w:tentative="1">
+      <w:start w:val="1"/>
+      <w:numFmt w:val="bullet"/>
+      <w:lvlText w:val="o"/>
+      <w:lvlJc w:val="left"/>
+      <w:pPr>
+        <w:tabs>
+          <w:tab w:val="num" w:pos="1440"/>
+        </w:tabs>
+        <w:ind w:left="1440" w:hanging="360"/>
+      </w:pPr>
+      <w:rPr>
+        <w:rFonts w:ascii="Courier New" w:hAnsi="Courier New" w:hint="default"/>
+        <w:sz w:val="20"/>
+      </w:rPr>
+    </w:lvl>
+    <w:lvl w:ilvl="2" w:tentative="1">
+      <w:start w:val="1"/>
+      <w:numFmt w:val="bullet"/>
+      <w:lvlText w:val=""/>
+      <w:lvlJc w:val="left"/>
+      <w:pPr>
+        <w:tabs>
+          <w:tab w:val="num" w:pos="2160"/>
+        </w:tabs>
+        <w:ind w:left="2160" w:hanging="360"/>
+      </w:pPr>
+      <w:rPr>
+        <w:rFonts w:ascii="Wingdings" w:hAnsi="Wingdings" w:hint="default"/>
+        <w:sz w:val="20"/>
+      </w:rPr>
+    </w:lvl>
+    <w:lvl w:ilvl="3" w:tentative="1">
+      <w:start w:val="1"/>
+      <w:numFmt w:val="bullet"/>
+      <w:lvlText w:val=""/>
+      <w:lvlJc w:val="left"/>
+      <w:pPr>
+        <w:tabs>
+          <w:tab w:val="num" w:pos="2880"/>
+        </w:tabs>
+        <w:ind w:left="2880" w:hanging="360"/>
+      </w:pPr>
+      <w:rPr>
+        <w:rFonts w:ascii="Wingdings" w:hAnsi="Wingdings" w:hint="default"/>
+        <w:sz w:val="20"/>
+      </w:rPr>
+    </w:lvl>
+    <w:lvl w:ilvl="4" w:tentative="1">
+      <w:start w:val="1"/>
+      <w:numFmt w:val="bullet"/>
+      <w:lvlText w:val=""/>
+      <w:lvlJc w:val="left"/>
+      <w:pPr>
+        <w:tabs>
+          <w:tab w:val="num" w:pos="3600"/>
+        </w:tabs>
+        <w:ind w:left="3600" w:hanging="360"/>
+      </w:pPr>
+      <w:rPr>
+        <w:rFonts w:ascii="Wingdings" w:hAnsi="Wingdings" w:hint="default"/>
+        <w:sz w:val="20"/>
+      </w:rPr>
+    </w:lvl>
+    <w:lvl w:ilvl="5" w:tentative="1">
+      <w:start w:val="1"/>
+      <w:numFmt w:val="bullet"/>
+      <w:lvlText w:val=""/>
+      <w:lvlJc w:val="left"/>
+      <w:pPr>
+        <w:tabs>
+          <w:tab w:val="num" w:pos="4320"/>
+        </w:tabs>
+        <w:ind w:left="4320" w:hanging="360"/>
+      </w:pPr>
+      <w:rPr>
+        <w:rFonts w:ascii="Wingdings" w:hAnsi="Wingdings" w:hint="default"/>
+        <w:sz w:val="20"/>
+      </w:rPr>
+    </w:lvl>
+    <w:lvl w:ilvl="6" w:tentative="1">
+      <w:start w:val="1"/>
+      <w:numFmt w:val="bullet"/>
+      <w:lvlText w:val=""/>
+      <w:lvlJc w:val="left"/>
+      <w:pPr>
+        <w:tabs>
+          <w:tab w:val="num" w:pos="5040"/>
+        </w:tabs>
+        <w:ind w:left="5040" w:hanging="360"/>
+      </w:pPr>
+      <w:rPr>
+        <w:rFonts w:ascii="Wingdings" w:hAnsi="Wingdings" w:hint="default"/>
+        <w:sz w:val="20"/>
+      </w:rPr>
+    </w:lvl>
+    <w:lvl w:ilvl="7" w:tentative="1">
+      <w:start w:val="1"/>
+      <w:numFmt w:val="bullet"/>
+      <w:lvlText w:val=""/>
+      <w:lvlJc w:val="left"/>
+      <w:pPr>
+        <w:tabs>
+          <w:tab w:val="num" w:pos="5760"/>
+        </w:tabs>
+        <w:ind w:left="5760" w:hanging="360"/>
+      </w:pPr>
+      <w:rPr>
+        <w:rFonts w:ascii="Wingdings" w:hAnsi="Wingdings" w:hint="default"/>
+        <w:sz w:val="20"/>
+      </w:rPr>
+    </w:lvl>
+    <w:lvl w:ilvl="8" w:tentative="1">
+      <w:start w:val="1"/>
+      <w:numFmt w:val="bullet"/>
+      <w:lvlText w:val=""/>
+      <w:lvlJc w:val="left"/>
+      <w:pPr>
+        <w:tabs>
+          <w:tab w:val="num" w:pos="6480"/>
+        </w:tabs>
+        <w:ind w:left="6480" w:hanging="360"/>
+      </w:pPr>
+      <w:rPr>
+        <w:rFonts w:ascii="Wingdings" w:hAnsi="Wingdings" w:hint="default"/>
+        <w:sz w:val="20"/>
+      </w:rPr>
+    </w:lvl>
+  </w:abstractNum>
+  <w:abstractNum w:abstractNumId="14" w15:restartNumberingAfterBreak="0">
     <w:nsid w:val="55987A7B"/>
     <w:multiLevelType w:val="multilevel"/>
     <w:tmpl w:val="2FD2E2F6"/>
@@ -7725,7 +8534,7 @@
       </w:rPr>
     </w:lvl>
   </w:abstractNum>
-  <w:abstractNum w:abstractNumId="11" w15:restartNumberingAfterBreak="0">
+  <w:abstractNum w:abstractNumId="15" w15:restartNumberingAfterBreak="0">
     <w:nsid w:val="5F3955F4"/>
     <w:multiLevelType w:val="multilevel"/>
     <w:tmpl w:val="998286C0"/>
@@ -7874,7 +8683,7 @@
       </w:rPr>
     </w:lvl>
   </w:abstractNum>
-  <w:abstractNum w:abstractNumId="12" w15:restartNumberingAfterBreak="0">
+  <w:abstractNum w:abstractNumId="16" w15:restartNumberingAfterBreak="0">
     <w:nsid w:val="621E682A"/>
     <w:multiLevelType w:val="multilevel"/>
     <w:tmpl w:val="AC3C1E8E"/>
@@ -8023,7 +8832,7 @@
       </w:rPr>
     </w:lvl>
   </w:abstractNum>
-  <w:abstractNum w:abstractNumId="13" w15:restartNumberingAfterBreak="0">
+  <w:abstractNum w:abstractNumId="17" w15:restartNumberingAfterBreak="0">
     <w:nsid w:val="627D324B"/>
     <w:multiLevelType w:val="multilevel"/>
     <w:tmpl w:val="39340132"/>
@@ -8172,7 +8981,7 @@
       </w:rPr>
     </w:lvl>
   </w:abstractNum>
-  <w:abstractNum w:abstractNumId="14" w15:restartNumberingAfterBreak="0">
+  <w:abstractNum w:abstractNumId="18" w15:restartNumberingAfterBreak="0">
     <w:nsid w:val="64BE183A"/>
     <w:multiLevelType w:val="multilevel"/>
     <w:tmpl w:val="40CAE192"/>
@@ -8321,7 +9130,7 @@
       </w:rPr>
     </w:lvl>
   </w:abstractNum>
-  <w:abstractNum w:abstractNumId="15" w15:restartNumberingAfterBreak="0">
+  <w:abstractNum w:abstractNumId="19" w15:restartNumberingAfterBreak="0">
     <w:nsid w:val="6510758C"/>
     <w:multiLevelType w:val="multilevel"/>
     <w:tmpl w:val="A2F61FDC"/>
@@ -8470,7 +9279,7 @@
       </w:rPr>
     </w:lvl>
   </w:abstractNum>
-  <w:abstractNum w:abstractNumId="16" w15:restartNumberingAfterBreak="0">
+  <w:abstractNum w:abstractNumId="20" w15:restartNumberingAfterBreak="0">
     <w:nsid w:val="65CE54BF"/>
     <w:multiLevelType w:val="multilevel"/>
     <w:tmpl w:val="B0AEA722"/>
@@ -8619,7 +9428,156 @@
       </w:rPr>
     </w:lvl>
   </w:abstractNum>
-  <w:abstractNum w:abstractNumId="17" w15:restartNumberingAfterBreak="0">
+  <w:abstractNum w:abstractNumId="21" w15:restartNumberingAfterBreak="0">
+    <w:nsid w:val="6C9302D5"/>
+    <w:multiLevelType w:val="multilevel"/>
+    <w:tmpl w:val="8B4ED36C"/>
+    <w:lvl w:ilvl="0">
+      <w:start w:val="1"/>
+      <w:numFmt w:val="bullet"/>
+      <w:lvlText w:val=""/>
+      <w:lvlJc w:val="left"/>
+      <w:pPr>
+        <w:tabs>
+          <w:tab w:val="num" w:pos="720"/>
+        </w:tabs>
+        <w:ind w:left="720" w:hanging="360"/>
+      </w:pPr>
+      <w:rPr>
+        <w:rFonts w:ascii="Symbol" w:hAnsi="Symbol" w:hint="default"/>
+        <w:sz w:val="20"/>
+      </w:rPr>
+    </w:lvl>
+    <w:lvl w:ilvl="1" w:tentative="1">
+      <w:start w:val="1"/>
+      <w:numFmt w:val="bullet"/>
+      <w:lvlText w:val="o"/>
+      <w:lvlJc w:val="left"/>
+      <w:pPr>
+        <w:tabs>
+          <w:tab w:val="num" w:pos="1440"/>
+        </w:tabs>
+        <w:ind w:left="1440" w:hanging="360"/>
+      </w:pPr>
+      <w:rPr>
+        <w:rFonts w:ascii="Courier New" w:hAnsi="Courier New" w:hint="default"/>
+        <w:sz w:val="20"/>
+      </w:rPr>
+    </w:lvl>
+    <w:lvl w:ilvl="2" w:tentative="1">
+      <w:start w:val="1"/>
+      <w:numFmt w:val="bullet"/>
+      <w:lvlText w:val=""/>
+      <w:lvlJc w:val="left"/>
+      <w:pPr>
+        <w:tabs>
+          <w:tab w:val="num" w:pos="2160"/>
+        </w:tabs>
+        <w:ind w:left="2160" w:hanging="360"/>
+      </w:pPr>
+      <w:rPr>
+        <w:rFonts w:ascii="Wingdings" w:hAnsi="Wingdings" w:hint="default"/>
+        <w:sz w:val="20"/>
+      </w:rPr>
+    </w:lvl>
+    <w:lvl w:ilvl="3" w:tentative="1">
+      <w:start w:val="1"/>
+      <w:numFmt w:val="bullet"/>
+      <w:lvlText w:val=""/>
+      <w:lvlJc w:val="left"/>
+      <w:pPr>
+        <w:tabs>
+          <w:tab w:val="num" w:pos="2880"/>
+        </w:tabs>
+        <w:ind w:left="2880" w:hanging="360"/>
+      </w:pPr>
+      <w:rPr>
+        <w:rFonts w:ascii="Wingdings" w:hAnsi="Wingdings" w:hint="default"/>
+        <w:sz w:val="20"/>
+      </w:rPr>
+    </w:lvl>
+    <w:lvl w:ilvl="4" w:tentative="1">
+      <w:start w:val="1"/>
+      <w:numFmt w:val="bullet"/>
+      <w:lvlText w:val=""/>
+      <w:lvlJc w:val="left"/>
+      <w:pPr>
+        <w:tabs>
+          <w:tab w:val="num" w:pos="3600"/>
+        </w:tabs>
+        <w:ind w:left="3600" w:hanging="360"/>
+      </w:pPr>
+      <w:rPr>
+        <w:rFonts w:ascii="Wingdings" w:hAnsi="Wingdings" w:hint="default"/>
+        <w:sz w:val="20"/>
+      </w:rPr>
+    </w:lvl>
+    <w:lvl w:ilvl="5" w:tentative="1">
+      <w:start w:val="1"/>
+      <w:numFmt w:val="bullet"/>
+      <w:lvlText w:val=""/>
+      <w:lvlJc w:val="left"/>
+      <w:pPr>
+        <w:tabs>
+          <w:tab w:val="num" w:pos="4320"/>
+        </w:tabs>
+        <w:ind w:left="4320" w:hanging="360"/>
+      </w:pPr>
+      <w:rPr>
+        <w:rFonts w:ascii="Wingdings" w:hAnsi="Wingdings" w:hint="default"/>
+        <w:sz w:val="20"/>
+      </w:rPr>
+    </w:lvl>
+    <w:lvl w:ilvl="6" w:tentative="1">
+      <w:start w:val="1"/>
+      <w:numFmt w:val="bullet"/>
+      <w:lvlText w:val=""/>
+      <w:lvlJc w:val="left"/>
+      <w:pPr>
+        <w:tabs>
+          <w:tab w:val="num" w:pos="5040"/>
+        </w:tabs>
+        <w:ind w:left="5040" w:hanging="360"/>
+      </w:pPr>
+      <w:rPr>
+        <w:rFonts w:ascii="Wingdings" w:hAnsi="Wingdings" w:hint="default"/>
+        <w:sz w:val="20"/>
+      </w:rPr>
+    </w:lvl>
+    <w:lvl w:ilvl="7" w:tentative="1">
+      <w:start w:val="1"/>
+      <w:numFmt w:val="bullet"/>
+      <w:lvlText w:val=""/>
+      <w:lvlJc w:val="left"/>
+      <w:pPr>
+        <w:tabs>
+          <w:tab w:val="num" w:pos="5760"/>
+        </w:tabs>
+        <w:ind w:left="5760" w:hanging="360"/>
+      </w:pPr>
+      <w:rPr>
+        <w:rFonts w:ascii="Wingdings" w:hAnsi="Wingdings" w:hint="default"/>
+        <w:sz w:val="20"/>
+      </w:rPr>
+    </w:lvl>
+    <w:lvl w:ilvl="8" w:tentative="1">
+      <w:start w:val="1"/>
+      <w:numFmt w:val="bullet"/>
+      <w:lvlText w:val=""/>
+      <w:lvlJc w:val="left"/>
+      <w:pPr>
+        <w:tabs>
+          <w:tab w:val="num" w:pos="6480"/>
+        </w:tabs>
+        <w:ind w:left="6480" w:hanging="360"/>
+      </w:pPr>
+      <w:rPr>
+        <w:rFonts w:ascii="Wingdings" w:hAnsi="Wingdings" w:hint="default"/>
+        <w:sz w:val="20"/>
+      </w:rPr>
+    </w:lvl>
+  </w:abstractNum>
+  <w:abstractNum w:abstractNumId="22" w15:restartNumberingAfterBreak="0">
     <w:nsid w:val="6FEC0187"/>
     <w:multiLevelType w:val="multilevel"/>
     <w:tmpl w:val="A9B62278"/>
@@ -8768,7 +9726,7 @@
       </w:rPr>
     </w:lvl>
   </w:abstractNum>
-  <w:abstractNum w:abstractNumId="18" w15:restartNumberingAfterBreak="0">
+  <w:abstractNum w:abstractNumId="23" w15:restartNumberingAfterBreak="0">
     <w:nsid w:val="73AC549E"/>
     <w:multiLevelType w:val="multilevel"/>
     <w:tmpl w:val="E4F88456"/>
@@ -8917,7 +9875,7 @@
       </w:rPr>
     </w:lvl>
   </w:abstractNum>
-  <w:abstractNum w:abstractNumId="19" w15:restartNumberingAfterBreak="0">
+  <w:abstractNum w:abstractNumId="24" w15:restartNumberingAfterBreak="0">
     <w:nsid w:val="762243A8"/>
     <w:multiLevelType w:val="multilevel"/>
     <w:tmpl w:val="7BACE8EE"/>
@@ -9066,7 +10024,120 @@
       </w:rPr>
     </w:lvl>
   </w:abstractNum>
-  <w:abstractNum w:abstractNumId="20" w15:restartNumberingAfterBreak="0">
+  <w:abstractNum w:abstractNumId="25" w15:restartNumberingAfterBreak="0">
+    <w:nsid w:val="769A4E7A"/>
+    <w:multiLevelType w:val="multilevel"/>
+    <w:tmpl w:val="B74C5E78"/>
+    <w:lvl w:ilvl="0">
+      <w:start w:val="1"/>
+      <w:numFmt w:val="decimal"/>
+      <w:lvlText w:val="%1."/>
+      <w:lvlJc w:val="left"/>
+      <w:pPr>
+        <w:tabs>
+          <w:tab w:val="num" w:pos="720"/>
+        </w:tabs>
+        <w:ind w:left="720" w:hanging="360"/>
+      </w:pPr>
+    </w:lvl>
+    <w:lvl w:ilvl="1" w:tentative="1">
+      <w:start w:val="1"/>
+      <w:numFmt w:val="decimal"/>
+      <w:lvlText w:val="%2."/>
+      <w:lvlJc w:val="left"/>
+      <w:pPr>
+        <w:tabs>
+          <w:tab w:val="num" w:pos="1440"/>
+        </w:tabs>
+        <w:ind w:left="1440" w:hanging="360"/>
+      </w:pPr>
+    </w:lvl>
+    <w:lvl w:ilvl="2" w:tentative="1">
+      <w:start w:val="1"/>
+      <w:numFmt w:val="decimal"/>
+      <w:lvlText w:val="%3."/>
+      <w:lvlJc w:val="left"/>
+      <w:pPr>
+        <w:tabs>
+          <w:tab w:val="num" w:pos="2160"/>
+        </w:tabs>
+        <w:ind w:left="2160" w:hanging="360"/>
+      </w:pPr>
+    </w:lvl>
+    <w:lvl w:ilvl="3" w:tentative="1">
+      <w:start w:val="1"/>
+      <w:numFmt w:val="decimal"/>
+      <w:lvlText w:val="%4."/>
+      <w:lvlJc w:val="left"/>
+      <w:pPr>
+        <w:tabs>
+          <w:tab w:val="num" w:pos="2880"/>
+        </w:tabs>
+        <w:ind w:left="2880" w:hanging="360"/>
+      </w:pPr>
+    </w:lvl>
+    <w:lvl w:ilvl="4" w:tentative="1">
+      <w:start w:val="1"/>
+      <w:numFmt w:val="decimal"/>
+      <w:lvlText w:val="%5."/>
+      <w:lvlJc w:val="left"/>
+      <w:pPr>
+        <w:tabs>
+          <w:tab w:val="num" w:pos="3600"/>
+        </w:tabs>
+        <w:ind w:left="3600" w:hanging="360"/>
+      </w:pPr>
+    </w:lvl>
+    <w:lvl w:ilvl="5" w:tentative="1">
+      <w:start w:val="1"/>
+      <w:numFmt w:val="decimal"/>
+      <w:lvlText w:val="%6."/>
+      <w:lvlJc w:val="left"/>
+      <w:pPr>
+        <w:tabs>
+          <w:tab w:val="num" w:pos="4320"/>
+        </w:tabs>
+        <w:ind w:left="4320" w:hanging="360"/>
+      </w:pPr>
+    </w:lvl>
+    <w:lvl w:ilvl="6" w:tentative="1">
+      <w:start w:val="1"/>
+      <w:numFmt w:val="decimal"/>
+      <w:lvlText w:val="%7."/>
+      <w:lvlJc w:val="left"/>
+      <w:pPr>
+        <w:tabs>
+          <w:tab w:val="num" w:pos="5040"/>
+        </w:tabs>
+        <w:ind w:left="5040" w:hanging="360"/>
+      </w:pPr>
+    </w:lvl>
+    <w:lvl w:ilvl="7" w:tentative="1">
+      <w:start w:val="1"/>
+      <w:numFmt w:val="decimal"/>
+      <w:lvlText w:val="%8."/>
+      <w:lvlJc w:val="left"/>
+      <w:pPr>
+        <w:tabs>
+          <w:tab w:val="num" w:pos="5760"/>
+        </w:tabs>
+        <w:ind w:left="5760" w:hanging="360"/>
+      </w:pPr>
+    </w:lvl>
+    <w:lvl w:ilvl="8" w:tentative="1">
+      <w:start w:val="1"/>
+      <w:numFmt w:val="decimal"/>
+      <w:lvlText w:val="%9."/>
+      <w:lvlJc w:val="left"/>
+      <w:pPr>
+        <w:tabs>
+          <w:tab w:val="num" w:pos="6480"/>
+        </w:tabs>
+        <w:ind w:left="6480" w:hanging="360"/>
+      </w:pPr>
+    </w:lvl>
+  </w:abstractNum>
+  <w:abstractNum w:abstractNumId="26" w15:restartNumberingAfterBreak="0">
     <w:nsid w:val="7759644F"/>
     <w:multiLevelType w:val="multilevel"/>
     <w:tmpl w:val="E17839CC"/>
@@ -9216,37 +10287,37 @@
     </w:lvl>
   </w:abstractNum>
   <w:num w:numId="1" w16cid:durableId="1660500837">
-    <w:abstractNumId w:val="6"/>
+    <w:abstractNumId w:val="7"/>
   </w:num>
   <w:num w:numId="2" w16cid:durableId="1432627776">
-    <w:abstractNumId w:val="8"/>
+    <w:abstractNumId w:val="11"/>
   </w:num>
   <w:num w:numId="3" w16cid:durableId="1586837115">
     <w:abstractNumId w:val="0"/>
   </w:num>
   <w:num w:numId="4" w16cid:durableId="1201748180">
-    <w:abstractNumId w:val="10"/>
+    <w:abstractNumId w:val="14"/>
   </w:num>
   <w:num w:numId="5" w16cid:durableId="873276397">
-    <w:abstractNumId w:val="16"/>
+    <w:abstractNumId w:val="20"/>
   </w:num>
   <w:num w:numId="6" w16cid:durableId="2055696050">
     <w:abstractNumId w:val="1"/>
   </w:num>
   <w:num w:numId="7" w16cid:durableId="1287350875">
+    <w:abstractNumId w:val="24"/>
+  </w:num>
+  <w:num w:numId="8" w16cid:durableId="1289824601">
     <w:abstractNumId w:val="19"/>
   </w:num>
-  <w:num w:numId="8" w16cid:durableId="1289824601">
-    <w:abstractNumId w:val="15"/>
-  </w:num>
   <w:num w:numId="9" w16cid:durableId="944388539">
-    <w:abstractNumId w:val="18"/>
+    <w:abstractNumId w:val="23"/>
   </w:num>
   <w:num w:numId="10" w16cid:durableId="1417744659">
-    <w:abstractNumId w:val="20"/>
+    <w:abstractNumId w:val="26"/>
   </w:num>
   <w:num w:numId="11" w16cid:durableId="1768649211">
-    <w:abstractNumId w:val="7"/>
+    <w:abstractNumId w:val="9"/>
   </w:num>
   <w:num w:numId="12" w16cid:durableId="55276124">
     <w:abstractNumId w:val="2"/>
@@ -9255,28 +10326,46 @@
     <w:abstractNumId w:val="3"/>
   </w:num>
   <w:num w:numId="14" w16cid:durableId="1965649953">
-    <w:abstractNumId w:val="11"/>
+    <w:abstractNumId w:val="15"/>
   </w:num>
   <w:num w:numId="15" w16cid:durableId="1730038003">
-    <w:abstractNumId w:val="17"/>
+    <w:abstractNumId w:val="22"/>
   </w:num>
   <w:num w:numId="16" w16cid:durableId="920067302">
+    <w:abstractNumId w:val="16"/>
+  </w:num>
+  <w:num w:numId="17" w16cid:durableId="491875113">
     <w:abstractNumId w:val="12"/>
   </w:num>
-  <w:num w:numId="17" w16cid:durableId="491875113">
-    <w:abstractNumId w:val="9"/>
-  </w:num>
   <w:num w:numId="18" w16cid:durableId="357317160">
-    <w:abstractNumId w:val="14"/>
+    <w:abstractNumId w:val="18"/>
   </w:num>
   <w:num w:numId="19" w16cid:durableId="430322561">
-    <w:abstractNumId w:val="13"/>
+    <w:abstractNumId w:val="17"/>
   </w:num>
   <w:num w:numId="20" w16cid:durableId="1734236499">
     <w:abstractNumId w:val="4"/>
   </w:num>
   <w:num w:numId="21" w16cid:durableId="41253394">
+    <w:abstractNumId w:val="6"/>
+  </w:num>
+  <w:num w:numId="22" w16cid:durableId="1065251924">
+    <w:abstractNumId w:val="8"/>
+  </w:num>
+  <w:num w:numId="23" w16cid:durableId="1655985625">
     <w:abstractNumId w:val="5"/>
+  </w:num>
+  <w:num w:numId="24" w16cid:durableId="782504596">
+    <w:abstractNumId w:val="10"/>
+  </w:num>
+  <w:num w:numId="25" w16cid:durableId="1118336377">
+    <w:abstractNumId w:val="25"/>
+  </w:num>
+  <w:num w:numId="26" w16cid:durableId="896866764">
+    <w:abstractNumId w:val="21"/>
+  </w:num>
+  <w:num w:numId="27" w16cid:durableId="1145002781">
+    <w:abstractNumId w:val="13"/>
   </w:num>
 </w:numbering>
 </file>

</xml_diff>